<commit_message>
add reusable profiles and adversarial evaluation
</commit_message>
<xml_diff>
--- a/fssai-ra/docs/extended-abstract.docx
+++ b/fssai-ra/docs/extended-abstract.docx
@@ -5,57 +5,274 @@
     <w:p>
       <w:pPr>
         <w:pStyle w:val="Title"/>
+        <w:jc w:val="left"/>
       </w:pPr>
       <w:r>
-        <w:t>Trust by Construction</w:t>
+        <w:rPr>
+          <w:rFonts w:ascii="Arial" w:hAnsi="Arial"/>
+          <w:b/>
+          <w:i w:val="0"/>
+          <w:color w:val="000000"/>
+          <w:sz w:val="36"/>
+        </w:rPr>
+        <w:t>Trust by Construction A Testable Architecture for Sovereign AI Agents in Education</w:t>
       </w:r>
     </w:p>
     <w:p>
       <w:pPr>
-        <w:pStyle w:val="Subtitle"/>
+        <w:spacing w:after="200"/>
       </w:pPr>
       <w:r>
-        <w:t>A Testable Architecture for Sovereign AI Agents in Education</w:t>
+        <w:rPr>
+          <w:rFonts w:ascii="Arial" w:hAnsi="Arial"/>
+          <w:b w:val="0"/>
+          <w:i/>
+          <w:color w:val="000000"/>
+          <w:sz w:val="22"/>
+        </w:rPr>
+        <w:t>Extended abstract for the UNU Macau AI Conference 2026</w:t>
+      </w:r>
+    </w:p>
+    <w:tbl>
+      <w:tblPr>
+        <w:tblW w:type="auto" w:w="0"/>
+        <w:tblLayout w:type="fixed"/>
+        <w:tblLook w:firstColumn="1" w:firstRow="1" w:lastColumn="0" w:lastRow="0" w:noHBand="0" w:noVBand="1" w:val="04A0"/>
+        <w:tblBorders>
+          <w:top w:val="single" w:sz="6" w:color="D9D9D9"/>
+          <w:left w:val="single" w:sz="6" w:color="D9D9D9"/>
+          <w:bottom w:val="single" w:sz="6" w:color="D9D9D9"/>
+          <w:right w:val="single" w:sz="6" w:color="D9D9D9"/>
+          <w:insideH w:val="single" w:sz="6" w:color="D9D9D9"/>
+          <w:insideV w:val="single" w:sz="6" w:color="D9D9D9"/>
+        </w:tblBorders>
+      </w:tblPr>
+      <w:tblGrid>
+        <w:gridCol w:w="1944"/>
+        <w:gridCol w:w="7632"/>
+      </w:tblGrid>
+      <w:tr>
+        <w:tc>
+          <w:tcPr>
+            <w:tcW w:type="dxa" w:w="1944"/>
+            <w:vAlign w:val="center"/>
+            <w:tcMar>
+              <w:top w:w="100" w:type="dxa"/>
+              <w:start w:w="120" w:type="dxa"/>
+              <w:bottom w:w="100" w:type="dxa"/>
+              <w:end w:w="120" w:type="dxa"/>
+            </w:tcMar>
+          </w:tcPr>
+          <w:p>
+            <w:r>
+              <w:rPr>
+                <w:rFonts w:ascii="Arial" w:hAnsi="Arial"/>
+                <w:b/>
+                <w:i w:val="0"/>
+                <w:color w:val="000000"/>
+                <w:sz w:val="18"/>
+              </w:rPr>
+              <w:t>Proposed panel</w:t>
+            </w:r>
+          </w:p>
+        </w:tc>
+        <w:tc>
+          <w:tcPr>
+            <w:tcW w:type="dxa" w:w="7632"/>
+            <w:vAlign w:val="center"/>
+            <w:tcMar>
+              <w:top w:w="100" w:type="dxa"/>
+              <w:start w:w="120" w:type="dxa"/>
+              <w:bottom w:w="100" w:type="dxa"/>
+              <w:end w:w="120" w:type="dxa"/>
+            </w:tcMar>
+          </w:tcPr>
+          <w:p>
+            <w:r>
+              <w:rPr>
+                <w:rFonts w:ascii="Arial" w:hAnsi="Arial"/>
+                <w:b w:val="0"/>
+                <w:i w:val="0"/>
+                <w:color w:val="000000"/>
+                <w:sz w:val="18"/>
+              </w:rPr>
+              <w:t>Agentic AI in the Loop From Autonomous Tools to Shared Capacity</w:t>
+            </w:r>
+          </w:p>
+        </w:tc>
+      </w:tr>
+      <w:tr>
+        <w:tc>
+          <w:tcPr>
+            <w:tcW w:type="dxa" w:w="1944"/>
+            <w:vAlign w:val="center"/>
+            <w:tcMar>
+              <w:top w:w="100" w:type="dxa"/>
+              <w:start w:w="120" w:type="dxa"/>
+              <w:bottom w:w="100" w:type="dxa"/>
+              <w:end w:w="120" w:type="dxa"/>
+            </w:tcMar>
+          </w:tcPr>
+          <w:p>
+            <w:r>
+              <w:rPr>
+                <w:rFonts w:ascii="Arial" w:hAnsi="Arial"/>
+                <w:b/>
+                <w:i w:val="0"/>
+                <w:color w:val="000000"/>
+                <w:sz w:val="18"/>
+              </w:rPr>
+              <w:t>Keywords</w:t>
+            </w:r>
+          </w:p>
+        </w:tc>
+        <w:tc>
+          <w:tcPr>
+            <w:tcW w:type="dxa" w:w="7632"/>
+            <w:vAlign w:val="center"/>
+            <w:tcMar>
+              <w:top w:w="100" w:type="dxa"/>
+              <w:start w:w="120" w:type="dxa"/>
+              <w:bottom w:w="100" w:type="dxa"/>
+              <w:end w:w="120" w:type="dxa"/>
+            </w:tcMar>
+          </w:tcPr>
+          <w:p>
+            <w:r>
+              <w:rPr>
+                <w:rFonts w:ascii="Arial" w:hAnsi="Arial"/>
+                <w:b w:val="0"/>
+                <w:i w:val="0"/>
+                <w:color w:val="000000"/>
+                <w:sz w:val="18"/>
+              </w:rPr>
+              <w:t>agentic AI, education, institutional sovereignty, fail secure architecture, human oversight, reproducibility, digital public goods</w:t>
+            </w:r>
+          </w:p>
+        </w:tc>
+      </w:tr>
+      <w:tr>
+        <w:tc>
+          <w:tcPr>
+            <w:tcW w:type="dxa" w:w="1944"/>
+            <w:vAlign w:val="center"/>
+            <w:tcMar>
+              <w:top w:w="100" w:type="dxa"/>
+              <w:start w:w="120" w:type="dxa"/>
+              <w:bottom w:w="100" w:type="dxa"/>
+              <w:end w:w="120" w:type="dxa"/>
+            </w:tcMar>
+          </w:tcPr>
+          <w:p>
+            <w:r>
+              <w:rPr>
+                <w:rFonts w:ascii="Arial" w:hAnsi="Arial"/>
+                <w:b/>
+                <w:i w:val="0"/>
+                <w:color w:val="000000"/>
+                <w:sz w:val="18"/>
+              </w:rPr>
+              <w:t>Companion repository</w:t>
+            </w:r>
+          </w:p>
+        </w:tc>
+        <w:tc>
+          <w:tcPr>
+            <w:tcW w:type="dxa" w:w="7632"/>
+            <w:vAlign w:val="center"/>
+            <w:tcMar>
+              <w:top w:w="100" w:type="dxa"/>
+              <w:start w:w="120" w:type="dxa"/>
+              <w:bottom w:w="100" w:type="dxa"/>
+              <w:end w:w="120" w:type="dxa"/>
+            </w:tcMar>
+          </w:tcPr>
+          <w:p>
+            <w:r>
+              <w:rPr>
+                <w:rFonts w:ascii="Arial" w:hAnsi="Arial"/>
+                <w:b w:val="0"/>
+                <w:i w:val="0"/>
+                <w:color w:val="000000"/>
+                <w:sz w:val="18"/>
+              </w:rPr>
+              <w:t>https://github.com/genaiworks/fssai-ra</w:t>
+            </w:r>
+          </w:p>
+        </w:tc>
+      </w:tr>
+    </w:tbl>
+    <w:p>
+      <w:pPr>
+        <w:spacing w:after="0"/>
+      </w:pPr>
+    </w:p>
+    <w:p>
+      <w:pPr>
+        <w:pStyle w:val="Heading1"/>
+      </w:pPr>
+      <w:r>
+        <w:t>Introduction</w:t>
       </w:r>
     </w:p>
     <w:p>
+      <w:pPr>
+        <w:pStyle w:val="Sectionnote"/>
+      </w:pPr>
       <w:r>
         <w:rPr>
-          <w:sz w:val="20"/>
+          <w:rFonts w:ascii="Arial" w:hAnsi="Arial"/>
+          <w:b w:val="0"/>
+          <w:i/>
+          <w:color w:val="000000"/>
+          <w:sz w:val="18"/>
         </w:rPr>
-      </w:r>
-      <w:r>
-        <w:rPr>
-          <w:b/>
-          <w:sz w:val="20"/>
-        </w:rPr>
-        <w:t>Proposed contribution:</w:t>
-      </w:r>
-      <w:r>
-        <w:rPr>
-          <w:sz w:val="20"/>
-        </w:rPr>
-        <w:t xml:space="preserve"> Panel 2 — Agentic AI in the Loop: From Autonomous Tools to Shared Capacity</w:t>
+        <w:t>Official limit 200 to 250 words  |  Draft count 218 words</w:t>
       </w:r>
     </w:p>
     <w:p>
+      <w:pPr>
+        <w:widowControl/>
+      </w:pPr>
       <w:r>
         <w:rPr>
-          <w:sz w:val="20"/>
+          <w:rFonts w:ascii="Arial" w:hAnsi="Arial"/>
+          <w:b w:val="0"/>
+          <w:i w:val="0"/>
+          <w:color w:val="000000"/>
+          <w:sz w:val="21"/>
         </w:rPr>
+        <w:t>An AI agent helping a university process student support applications may read confidential records, interpret eligibility guidance, draft recommendations, and invoke administrative tools. A malicious instruction in an uploaded document could redirect this workflow; an inaccurate recommendation could also harm a student without any attacker. The institutional question is therefore not only whether the model is trustworthy. It is what the system allows the model to do when it is wrong or compromised, what evidence survives, and how a person can challenge the outcome.</w:t>
       </w:r>
+    </w:p>
+    <w:p>
+      <w:pPr>
+        <w:widowControl/>
+      </w:pPr>
       <w:r>
         <w:rPr>
-          <w:b/>
-          <w:sz w:val="20"/>
+          <w:rFonts w:ascii="Arial" w:hAnsi="Arial"/>
+          <w:b w:val="0"/>
+          <w:i w:val="0"/>
+          <w:color w:val="000000"/>
+          <w:sz w:val="21"/>
         </w:rPr>
-        <w:t>Keywords:</w:t>
+        <w:t>This contribution presents Trust by Construction, a fail secure reference architecture for sovereign agentic AI in education. Sovereignty is defined as an institution's effective control over data access, deployment, keys, policy, operational evidence, and provider exit, rather than local hosting alone. Fail secure means that uncertainty or failure in a required authorization control stops a consequential automated action while a governed manual route preserves access to service.</w:t>
       </w:r>
+    </w:p>
+    <w:p>
+      <w:pPr>
+        <w:widowControl/>
+      </w:pPr>
       <w:r>
         <w:rPr>
-          <w:sz w:val="20"/>
+          <w:rFonts w:ascii="Arial" w:hAnsi="Arial"/>
+          <w:b w:val="0"/>
+          <w:i w:val="0"/>
+          <w:color w:val="000000"/>
+          <w:sz w:val="21"/>
         </w:rPr>
-        <w:t xml:space="preserve"> agentic AI; education; institutional sovereignty; fail-secure architecture; human oversight; reproducibility; open reference implementation</w:t>
+        <w:t>The original contribution is an executable control contract that connects each governance requirement to seven elements: a protected asset, permitted operation, independent enforcement point, accountable owner, failure test, evidence artifact, and recovery response. Using a synthetic student support workflow and an Apache 2.0 companion repository, the work asks whether this portable contract can contain specified agent failures while preserving useful assistance, review, correction, and institutional learning.</w:t>
       </w:r>
     </w:p>
     <w:p>
@@ -63,22 +280,112 @@
         <w:pStyle w:val="Heading1"/>
       </w:pPr>
       <w:r>
-        <w:t>1 Problem and research question</w:t>
+        <w:t>Development Section 1 Methodology Core Argument and Case Context</w:t>
       </w:r>
     </w:p>
     <w:p>
+      <w:pPr>
+        <w:pStyle w:val="Sectionnote"/>
+      </w:pPr>
       <w:r>
-        <w:t>An AI agent helping a university process student-support applications may read confidential records, interpret eligibility guidance, draft recommendations, and invoke administrative tools. A malicious instruction in an uploaded document could redirect this workflow. An inaccurate recommendation could also cause harm without any attacker. The institutional question is therefore concrete: when an agent is wrong or compromised, what prevents its proposal from becoming an unauthorized decision, and what evidence enables a person to challenge the outcome?</w:t>
+        <w:rPr>
+          <w:rFonts w:ascii="Arial" w:hAnsi="Arial"/>
+          <w:b w:val="0"/>
+          <w:i/>
+          <w:color w:val="000000"/>
+          <w:sz w:val="18"/>
+        </w:rPr>
+        <w:t>Official limit 550 to 650 words  |  Draft count 646 words</w:t>
       </w:r>
     </w:p>
     <w:p>
+      <w:pPr>
+        <w:widowControl/>
+      </w:pPr>
       <w:r>
-        <w:t>This contribution proposes a fail-secure reference architecture for sovereign agentic AI in education. Sovereignty means an institution's effective ability to govern data access, model deployment, cryptographic keys, policy changes, and operational evidence, including its ability to replace a provider. Local hosting supports these capabilities but does not establish them by itself. Fail-secure means that uncertainty or failure in required authorization controls prevents a consequential automated action, while a defined manual service preserves access to support. Confidentiality, decision quality, availability, and accountability require distinct safeguards.</w:t>
+        <w:rPr>
+          <w:rFonts w:ascii="Arial" w:hAnsi="Arial"/>
+          <w:b w:val="0"/>
+          <w:i w:val="0"/>
+          <w:color w:val="000000"/>
+          <w:sz w:val="21"/>
+        </w:rPr>
+        <w:t>The method combines established zero trust and AI risk guidance with an education specific workflow, explicit threat assumptions, and executable tests. NIST zero trust architecture rejects implicit trust based on network location and emphasizes authorization around resources (Rose et al., 2020). The NIST Generative AI Profile and OWASP agentic guidance identify risks involving content, tools, identities, goals, and system dependencies (National Institute of Standards and Technology, 2024; OWASP GenAI Security Project, 2025). The emerging OWASP Agent Control Standard provides portable runtime control hooks (OWASP GenAI Security Project, 2026). Trust by Construction does not claim to invent these controls. Its contribution is to integrate governance, enforcement, evidence, recovery, and teaching in a form that institutions can inspect and falsify. Sovereignty becomes operational only when an authority boundary can be named, exercised, failed, and independently evidenced, not merely asserted through hosting location, policy language, or vendor assurance.</w:t>
       </w:r>
     </w:p>
     <w:p>
+      <w:pPr>
+        <w:widowControl/>
+      </w:pPr>
       <w:r>
-        <w:t>The research question is: can a portable control contract contain specified agent failures while preserving useful assistance and feasible institutional oversight? The proposed contribution is an integration and evaluation method, grounded in an educational workflow, rather than a claim to invent zero trust or guarantee secure AI.</w:t>
+        <w:rPr>
+          <w:rFonts w:ascii="Arial" w:hAnsi="Arial"/>
+          <w:b w:val="0"/>
+          <w:i w:val="0"/>
+          <w:color w:val="000000"/>
+          <w:sz w:val="21"/>
+        </w:rPr>
+        <w:t>The illustrative case is deliberately bounded. A student submits synthetic supporting documents. An agent may retrieve records for its assigned case, assemble source passages, and propose moving that case from draft to ready for officer review. It cannot approve an award, broaden its access, delete evidence, or hold the credential used to update the case register. A named officer retains consequential authority, and the student retains an understandable explanation and a route to correction or appeal. The institution remains responsible for eligibility policy, discrimination risks, accessibility, and service quality; the presence of a human approval button does not establish fairness.</w:t>
+      </w:r>
+    </w:p>
+    <w:p>
+      <w:pPr>
+        <w:widowControl/>
+      </w:pPr>
+      <w:r>
+        <w:rPr>
+          <w:rFonts w:ascii="Arial" w:hAnsi="Arial"/>
+          <w:b w:val="0"/>
+          <w:i w:val="0"/>
+          <w:color w:val="000000"/>
+          <w:sz w:val="21"/>
+        </w:rPr>
+        <w:t>Five functional domains organize the architecture. Controlled import places external documents and updates in quarantine, verifies provenance where available, constrains parsing, and records release. A hardware one way gateway can strengthen directional assurance on a sensitive import link, but it does not make text truthful, remove ordinary language prompt injection, or close maintenance, telemetry, operator, and authorized output paths. Traceable transport assigns stable identifiers and documented ordering scopes, supports replay, and makes missing, duplicate, or out of order events explicit. Reconstructable evidence retains the records, transformations, retrieval configuration, exact passages, model artifact identity, recorded input and output, and policy version used for a decision. A signed manifest identifies retained bytes; it cannot restore deleted data, and exact regeneration of nondeterministic model text is not promised.</w:t>
+      </w:r>
+    </w:p>
+    <w:p>
+      <w:pPr>
+        <w:widowControl/>
+      </w:pPr>
+      <w:r>
+        <w:rPr>
+          <w:rFonts w:ascii="Arial" w:hAnsi="Arial"/>
+          <w:b w:val="0"/>
+          <w:i w:val="0"/>
+          <w:color w:val="000000"/>
+          <w:sz w:val="21"/>
+        </w:rPr>
+        <w:t>Bounded assistance gives each agent a case scoped identity, restricted tools, field level retrieval controls, and resource limits. Untrusted content never supplies access labels, approval status, or tool permissions. Accountable action separates proposal from authority. The executor, not the model, holds the write credential. Human approval is bound to a canonical digest covering the operation, target, arguments, evidence version, authoritative case version, audience, and expiry. The executor rechecks current state, rejects altered or stale proposals, records durable intent before mutation, and uses idempotency and reconciliation for interrupted outcomes. Evidence custody is separated from the agent, while an independent verifier checks continuity. These are functional responsibilities, not a mandatory vendor stack.</w:t>
+      </w:r>
+    </w:p>
+    <w:p>
+      <w:pPr>
+        <w:widowControl/>
+      </w:pPr>
+      <w:r>
+        <w:rPr>
+          <w:rFonts w:ascii="Arial" w:hAnsi="Arial"/>
+          <w:b w:val="0"/>
+          <w:i w:val="0"/>
+          <w:color w:val="000000"/>
+          <w:sz w:val="21"/>
+        </w:rPr>
+        <w:t>The open teaching profile implements the contract with synthetic records and in memory components. A validated application profile converts permitted operations, state transitions, approval roles, and manual fallback into executor checks; a template lets health, benefits, or justice teams substitute domain language without weakening the method silently. Optional adapters illustrate how teams can evaluate Kafka, Spark, Iceberg, or a local model against the same properties. Separate containers on one shared host demonstrate logical separation only. A compromised host administrator, signing authority, or colluding control owners remains outside the teaching profile's containment claim.</w:t>
+      </w:r>
+    </w:p>
+    <w:p>
+      <w:pPr>
+        <w:widowControl/>
+      </w:pPr>
+      <w:r>
+        <w:rPr>
+          <w:rFonts w:ascii="Arial" w:hAnsi="Arial"/>
+          <w:b w:val="0"/>
+          <w:i w:val="0"/>
+          <w:color w:val="000000"/>
+          <w:sz w:val="21"/>
+        </w:rPr>
+        <w:t>Sovereignty is assessed as a set of verifiable capabilities rather than a location label. An institution should be able to identify every operator who can access plaintext, administer its own identities and keys, retain decision evidence under its rules, continue essential service during provider failure, and replace a model or infrastructure provider without losing records or policy control. Physical isolation can strengthen one capability, but ownership of hardware alone does not satisfy the others.</w:t>
       </w:r>
     </w:p>
     <w:p>
@@ -86,22 +393,112 @@
         <w:pStyle w:val="Heading1"/>
       </w:pPr>
       <w:r>
-        <w:t>2 Contribution and assurance scope</w:t>
+        <w:t>Development Section 2 Results Analysis and Impact</w:t>
       </w:r>
     </w:p>
     <w:p>
+      <w:pPr>
+        <w:pStyle w:val="Sectionnote"/>
+      </w:pPr>
       <w:r>
-        <w:t>NIST's zero-trust architecture provides a foundation for explicit authorization [1], while its Generative AI Profile organizes relevant risks [2]. OWASP's agentic guidance identifies threats arising from agents' goals, tools, identities, and context [3]. Its Agent Control Standard describes portable runtime controls [4]. Building on these resources, the proposed contribution connects governance requirements to independently enforced controls, failure tests, recovery procedures, and named institutional responsibilities.</w:t>
+        <w:rPr>
+          <w:rFonts w:ascii="Arial" w:hAnsi="Arial"/>
+          <w:b w:val="0"/>
+          <w:i/>
+          <w:color w:val="000000"/>
+          <w:sz w:val="18"/>
+        </w:rPr>
+        <w:t>Official limit 550 to 650 words  |  Draft count 603 words</w:t>
       </w:r>
     </w:p>
     <w:p>
+      <w:pPr>
+        <w:widowControl/>
+      </w:pPr>
       <w:r>
-        <w:t>The control contract records, for each requirement, a protected asset, permitted operation, enforcement point, owner, test, evidence artifact, and failure response. For example, a student-support agent may prepare a recommendation for an assigned case, but cannot approve an award, broaden its own access, or delete its evidence. Successful authorization requires the execution service to verify the actual operation and current policy independently of the model's explanation.</w:t>
+        <w:rPr>
+          <w:rFonts w:ascii="Arial" w:hAnsi="Arial"/>
+          <w:b w:val="0"/>
+          <w:i w:val="0"/>
+          <w:color w:val="000000"/>
+          <w:sz w:val="21"/>
+        </w:rPr>
+        <w:t>At submission, the artifact is a runnable teaching profile and evaluation method, not a production deployment or security certification. In a verified local run on 10 September 2026, all thirty two deterministic contract, adversarial, ablation, profile, recovery, and exact action tests passed. A machine readable report separately recorded containment in eight of eight declared exact action scenarios: valid execution and idempotent retry; altered target and arguments; expired approval; forged reviewer identity; an unallowlisted operation; a profile forbidden transition; and interrupted outcome evidence. The six denial scenarios produced zero unauthorized mutations. The valid retry produced one mutation and one receipt. The interruption produced one mutation, an explicit uncertain status, and one reconciled outcome without duplication. These are fixture observations in a synthetic in memory environment, not estimated security probabilities.</w:t>
       </w:r>
     </w:p>
     <w:p>
+      <w:pPr>
+        <w:widowControl/>
+      </w:pPr>
       <w:r>
-        <w:t>The threat model assumes hostile documents and potentially compromised agent processes. It requires functioning enforcement services and protected administrative credentials. Compromise of a shared host administrator, signing authority, or multiple colluding control owners can defeat this assumption. Separate containers on one host demonstrate logical separation, not independent administrative trust. The architecture therefore makes bounded claims about identified failure paths, with its trusted components and remaining risks explicitly documented.</w:t>
+        <w:rPr>
+          <w:rFonts w:ascii="Arial" w:hAnsi="Arial"/>
+          <w:b w:val="0"/>
+          <w:i w:val="0"/>
+          <w:color w:val="000000"/>
+          <w:sz w:val="21"/>
+        </w:rPr>
+        <w:t>The broader evaluation protocol compares three configurations using identical synthetic tasks and starting state: model instructions with broad tools inside a sandbox, the complete declared control configuration, and variants that remove one control at a time. Deterministic malicious requests test enforcement independently of whether a live model happens to follow an attack; separate stochastic trials measure model behavior. Wider scenarios include hostile instructions in retrieved documents, poisoned guidance, unauthorized tool requests, substitution of an unapproved model artifact, attempted evidence modification, policy outage, and executor crashes around an external action. The current pending outcome store is intentionally in memory; production requires a durable outbox committed atomically with the authoritative mutation. A benign set measures whether legitimate assistance remains usable.</w:t>
+      </w:r>
+    </w:p>
+    <w:p>
+      <w:pPr>
+        <w:widowControl/>
+      </w:pPr>
+      <w:r>
+        <w:rPr>
+          <w:rFonts w:ascii="Arial" w:hAnsi="Arial"/>
+          <w:b w:val="0"/>
+          <w:i w:val="0"/>
+          <w:color w:val="000000"/>
+          <w:sz w:val="21"/>
+        </w:rPr>
+        <w:t>For each scenario, evaluation traces the initiating threat, enforcement decision, containment boundary, observable evidence, recovery step, and responsible actor. Primary measures are unauthorized actions completed per attempt, protected canary records disclosed per attempt, legitimate tasks completed, false denials, reconstructable evidence bundles, and unresolved interrupted outcomes. Operational measures include approval delay, reviewer effort, recovery time, and resource consumption. Reviewer exercises test whether staff detect plausible but unsupported recommendations and whether an appeal route produces a usable correction. Results will report denominators, configurations, uncertainty, exclusions, and failures rather than a single security score. Zero observed violations will never be described as zero risk.</w:t>
+      </w:r>
+    </w:p>
+    <w:p>
+      <w:pPr>
+        <w:widowControl/>
+      </w:pPr>
+      <w:r>
+        <w:rPr>
+          <w:rFonts w:ascii="Arial" w:hAnsi="Arial"/>
+          <w:b w:val="0"/>
+          <w:i w:val="0"/>
+          <w:color w:val="000000"/>
+          <w:sz w:val="21"/>
+        </w:rPr>
+        <w:t>The impact is both practical and educational. For AI for Learning, the approach supports administrative assistance while keeping high impact authority, evidence, and appeal institutionally governed. For Learning for AI, the repository becomes a laboratory: participants identify a trust boundary, attempt a violation, inspect the resulting evidence, remove a control, and recover the service. This advances human agency and critical evaluation emphasized by UNESCO's AI Competency Framework for Teachers (Miao &amp; Cukurova, 2024). Shared tests can build capacity without sharing student data.</w:t>
+      </w:r>
+    </w:p>
+    <w:p>
+      <w:pPr>
+        <w:widowControl/>
+      </w:pPr>
+      <w:r>
+        <w:rPr>
+          <w:rFonts w:ascii="Arial" w:hAnsi="Arial"/>
+          <w:b w:val="0"/>
+          <w:i w:val="0"/>
+          <w:color w:val="000000"/>
+          <w:sz w:val="21"/>
+        </w:rPr>
+        <w:t>The release is designed for extension rather than imitation. Contributors begin with one consequential action, write the seven field control contract, implement the enforcement point, add an attack test and a benign test, name the recovery owner, and disclose the assurance profile. A health, benefits, or justice team can replace the educational policy while retaining the method. Teaching, institutional pilot, and hardware isolated profiles carry distinct release gates, preventing a laptop demonstration from being marketed as sovereign production infrastructure. This supports the Global Digital Compact's commitments to digital public goods, capacity building, and interoperable governance while preserving national and institutional choice (United Nations, 2024).</w:t>
+      </w:r>
+    </w:p>
+    <w:p>
+      <w:pPr>
+        <w:widowControl/>
+      </w:pPr>
+      <w:r>
+        <w:rPr>
+          <w:rFonts w:ascii="Arial" w:hAnsi="Arial"/>
+          <w:b w:val="0"/>
+          <w:i w:val="0"/>
+          <w:color w:val="000000"/>
+          <w:sz w:val="21"/>
+        </w:rPr>
+        <w:t>Adoption follows a staged path. Institutions first select one bounded workflow, appoint a service owner, document the manual fallback, and validate local language, accessibility, and record retention requirements. They then measure reviewer workload and student outcomes before expanding autonomy. This sequencing is especially important for resource constrained institutions: right sized local components may reduce recurring dependency, but cost, energy, maintenance, and skills must be measured rather than assumed from deployment location.</w:t>
       </w:r>
     </w:p>
     <w:p>
@@ -109,133 +506,67 @@
         <w:pStyle w:val="Heading1"/>
       </w:pPr>
       <w:r>
-        <w:t>3 Architecture and educational workflow</w:t>
-      </w:r>
-    </w:p>
-    <w:p>
-      <w:r>
-        <w:t>Five functional domains organize the system. They represent responsibilities that institutions can implement with different technologies, rather than a mandatory procurement stack. Identity, policy administration, key management, and evidence protection cut across the domains and require authority separate from the agent runtime.</w:t>
-      </w:r>
-    </w:p>
-    <w:p>
-      <w:r/>
-      <w:r>
-        <w:rPr>
-          <w:b/>
-        </w:rPr>
-        <w:t>Controlled import.</w:t>
-      </w:r>
-      <w:r>
-        <w:t xml:space="preserve"> External documents and updates enter through quarantine, provenance checks, constrained parsing, and explicit release. Approved records retain source identifiers and content hashes. Removing active content reduces some risks but does not remove malicious instructions embedded in ordinary language or establish factual truth. Sensitive deployments may add a hardware one-way gateway on the import link. Its directional guarantee applies to that link only. Maintenance connections, operator interfaces, telemetry, and authorized outputs require their own controls.</w:t>
-      </w:r>
-    </w:p>
-    <w:p>
-      <w:r/>
-      <w:r>
-        <w:rPr>
-          <w:b/>
-        </w:rPr>
-        <w:t>Traceable transport.</w:t>
-      </w:r>
-      <w:r>
-        <w:t xml:space="preserve"> Each accepted item receives a stable identifier and a documented ordering scope. A durable queue supports restart and replay, with duplicate detection at downstream consumers. Kafka is one possible implementation, but partition ordering and configured retention do not constitute a permanent decision archive [5]. Missing, duplicate, and out-of-order events trigger explicit handling rather than silent assumptions about exactly-once processing.</w:t>
-      </w:r>
-    </w:p>
-    <w:p>
-      <w:r/>
-      <w:r>
-        <w:rPr>
-          <w:b/>
-        </w:rPr>
-        <w:t>Reconstructable evidence.</w:t>
-      </w:r>
-      <w:r>
-        <w:t xml:space="preserve"> Versioned datasets preserve the records used for a decision, together with transformation code, retrieval configuration, and the exact retrieved passages. Iceberg is one possible implementation, provided retention protects the required snapshots and their referenced files [6]. A signed manifest identifies evidence but cannot reconstruct data that has been deleted. Reconstruction means recovering the decision's inputs and recorded outputs; it does not promise identical text from a nondeterministic model rerun.</w:t>
-      </w:r>
-    </w:p>
-    <w:p>
-      <w:r/>
-      <w:r>
-        <w:rPr>
-          <w:b/>
-        </w:rPr>
-        <w:t>Bounded assistance.</w:t>
-      </w:r>
-      <w:r>
-        <w:t xml:space="preserve"> An approved model helps staff assemble evidence and draft an explanation. Each agent has a case-scoped identity, a restricted tool list, and limits on execution time and resource use. Retrieval services enforce record and field permissions before data reaches the model. Task routing can select a model, but cannot grant privileges or lower the required review level. Untrusted content never supplies authoritative access labels, approval status, or tool permissions.</w:t>
-      </w:r>
-    </w:p>
-    <w:p>
-      <w:r/>
-      <w:r>
-        <w:rPr>
-          <w:b/>
-        </w:rPr>
-        <w:t>Accountable action.</w:t>
-      </w:r>
-      <w:r>
-        <w:t xml:space="preserve"> Agents submit structured proposals to an execution service that holds the necessary credentials. A consequential operation requires an authorized reviewer to inspect the affected case, supporting evidence, uncertainty, and proposed change. Approval binds to the exact action, target, arguments, evidence version, and expiry. A changed proposal requires renewed approval. The executor rechecks policy and current record state, rejects reused approvals, and requires a durable intent receipt before attempting the action. Idempotent execution and reconciliation address interrupted operations whose outcome is uncertain. An independent evidence service records authorization and outcome, with a separate monitor checking continuity.</w:t>
-      </w:r>
-    </w:p>
-    <w:p>
-      <w:r>
-        <w:t>In the illustrative workflow, a student uploads synthetic supporting documents. The agent drafts a support recommendation, but a named officer decides whether to authorize a change. Students receive an understandable explanation and a route to correction or appeal. The institution retains responsibility for the underlying eligibility policy and its fairness. Human approval alone cannot establish that a recommendation is accurate or equitable.</w:t>
+        <w:t>Conclusion</w:t>
       </w:r>
     </w:p>
     <w:p>
       <w:pPr>
-        <w:pStyle w:val="Heading1"/>
+        <w:pStyle w:val="Sectionnote"/>
       </w:pPr>
       <w:r>
-        <w:t>4 Planned evaluation</w:t>
-      </w:r>
-    </w:p>
-    <w:p>
-      <w:r>
-        <w:t>This extended abstract presents a design and evaluation protocol. It reports no completed benchmark, deployment, or security certification. A synthetic-data testbed will compare a model-only guardrail baseline, the complete proposed control configuration, and variants that remove one control at a time. Each comparison will hold the task, attack input, model configuration, and relevant data state constant, with repeated trials where model behavior is stochastic.</w:t>
-      </w:r>
-    </w:p>
-    <w:p>
-      <w:r>
-        <w:t>The initial scenarios cover malicious instructions in retrieved documents, poisoned source evidence, an unauthorized tool request, substitution of an unapproved model artifact, alteration or replay of an approved action, and an attempt to modify decision evidence. Fault injection will additionally interrupt policy and evidence services and crash the executor around an external action. A benign task set will check whether legitimate assistance remains usable. These scenarios sample recognized risk classes [2,3]; they do not establish comprehensive threat coverage.</w:t>
-      </w:r>
-    </w:p>
-    <w:p>
-      <w:r>
-        <w:t>For each scenario, evaluation traces the initiating threat, enforcement decision, containment boundary, observable evidence, recovery step, and responsible actor. Primary measures include unauthorized actions completed per attempt, protected records disclosed per attempt, benign task completion, false denials, evidence reconstruction success, and unresolved execution outcomes. Operational measures include recovery time, approval delay, reviewer effort, and resource consumption. Results will include denominators, configuration details, and uncertainty rather than a single security score.</w:t>
-      </w:r>
-    </w:p>
-    <w:p>
-      <w:r>
-        <w:t>A release candidate must pass all predefined critical authorization and evidence tests in its declared environment. Any prohibited action completed, protected record exposed, or required evidence silently lost constitutes failure. Zero observed violations will describe the tested sample only. Review exercises will separately examine whether staff detect misleading recommendations and whether the appeal process yields a usable correction. Synthetic cases cannot establish real-world fairness or learning benefits.</w:t>
+        <w:rPr>
+          <w:rFonts w:ascii="Arial" w:hAnsi="Arial"/>
+          <w:b w:val="0"/>
+          <w:i/>
+          <w:color w:val="000000"/>
+          <w:sz w:val="18"/>
+        </w:rPr>
+        <w:t>Official limit 200 to 250 words  |  Draft count 229 words</w:t>
       </w:r>
     </w:p>
     <w:p>
       <w:pPr>
-        <w:pStyle w:val="Heading1"/>
+        <w:widowControl/>
       </w:pPr>
       <w:r>
-        <w:t>5 Shared capacity and open implementation</w:t>
+        <w:rPr>
+          <w:rFonts w:ascii="Arial" w:hAnsi="Arial"/>
+          <w:b w:val="0"/>
+          <w:i w:val="0"/>
+          <w:color w:val="000000"/>
+          <w:sz w:val="21"/>
+        </w:rPr>
+        <w:t>Trustworthy agentic AI cannot rest on model behavior, certifications, encryption, or human review in isolation. For a consequential workflow, the institution must be able to show where authority resides, which action the approval covers, what happens when a control fails, which evidence survives, and who restores service. Trust by Construction turns those questions into a portable, testable control contract.</w:t>
       </w:r>
     </w:p>
     <w:p>
+      <w:pPr>
+        <w:widowControl/>
+      </w:pPr>
       <w:r>
-        <w:t>The architecture addresses both directions of the conference theme. For “AI for Learning,” it proposes a way to support educational administration while keeping consequential authority accountable. For “Learning for AI,” the same testbed becomes a teaching environment: participants identify a trust boundary, attempt a policy violation, inspect its evidence, and recover the workflow. This complements UNESCO's emphasis on teachers' AI knowledge, ethics, and professional capacity [7].</w:t>
+        <w:rPr>
+          <w:rFonts w:ascii="Arial" w:hAnsi="Arial"/>
+          <w:b w:val="0"/>
+          <w:i w:val="0"/>
+          <w:color w:val="000000"/>
+          <w:sz w:val="21"/>
+        </w:rPr>
+        <w:t>The student support case demonstrates the central rule: an agent may assemble evidence and propose an action, but it cannot convert its own recommendation into institutional authority. A changed proposal requires renewed review. An unavailable authorization service pauses automation. A durable evidence bundle supports investigation, correction, and appeal. These controls contain specified failure paths; they do not guarantee accurate, fair, or beneficial decisions, and they do not erase the need for domain policy, trained reviewers, accessibility, and redress.</w:t>
       </w:r>
     </w:p>
     <w:p>
+      <w:pPr>
+        <w:widowControl/>
+      </w:pPr>
       <w:r>
-        <w:t>The planned GitHub release will contain the control contract, threat model, synthetic cases, executable tests, deployment profiles, recovery runbooks, and versioned evaluation reports. Original implementation code is intended for a permissive license, subject to dependency and model-license compatibility. A laptop teaching profile will make the concepts accessible; an institutional profile will separate control administration and evidence custody. A hardware-isolated profile will document additional equipment and operational requirements. Passing a teaching profile will not imply equivalent production assurance.</w:t>
-      </w:r>
-    </w:p>
-    <w:p>
-      <w:r>
-        <w:t>Adoption begins with one bounded workflow and a named service owner. Institutions will establish a manual fallback, validate local-language evidence and accessibility, train reviewers, and measure workload before expanding autonomy. Cost and energy benefits remain empirical questions, including hardware, utilization, maintenance, and staff time. Sharing test cases and control improvements can build capacity across institutions without exchanging student records, supporting the Global Digital Compact's commitment to digital public goods and cooperation [8].</w:t>
-      </w:r>
-    </w:p>
-    <w:p>
-      <w:r>
-        <w:t>The central proposition is actionable: every consequential agent capability should have an identified authorization boundary, an executable failure test, and a recovery owner. Publishing these together would give institutions a concrete basis for deciding which powers to delegate, which evidence to demand, and when automation must stop.</w:t>
+        <w:rPr>
+          <w:rFonts w:ascii="Arial" w:hAnsi="Arial"/>
+          <w:b w:val="0"/>
+          <w:i w:val="0"/>
+          <w:color w:val="000000"/>
+          <w:sz w:val="21"/>
+        </w:rPr>
+        <w:t>The next phase will expand fault injection, stochastic attack trials, reviewer studies, deployment boundary tests, and measured cost and energy reporting. Independent contributors can extend the Apache 2.0 repository at https://github.com/genaiworks/fssai-ra by adding application profiles, domain contracts, adapters, attacks, benign cases, and recovery procedures, then publish comparable JSON results. The practical challenge to every adopting institution is simple: for each consequential agent capability, identify the independent authorization boundary, run a failure test against the real side effect, retain reconstructable evidence, and name the person accountable for recovery.</w:t>
       </w:r>
     </w:p>
     <w:p>
@@ -249,209 +580,170 @@
     <w:p>
       <w:pPr>
         <w:spacing w:after="100"/>
+        <w:ind w:left="317" w:hanging="317"/>
       </w:pPr>
       <w:r>
         <w:rPr>
-          <w:sz w:val="19"/>
+          <w:rFonts w:ascii="Arial" w:hAnsi="Arial"/>
+          <w:b w:val="0"/>
+          <w:i w:val="0"/>
+          <w:color w:val="000000"/>
+          <w:sz w:val="18"/>
         </w:rPr>
-        <w:t xml:space="preserve">[1] Rose, S., Borchert, O., Mitchell, S., and Connelly, S. (2020). </w:t>
-      </w:r>
-      <w:r>
-        <w:rPr>
-          <w:i/>
-          <w:sz w:val="19"/>
-        </w:rPr>
-        <w:t>Zero Trust Architecture</w:t>
-      </w:r>
-      <w:r>
-        <w:rPr>
-          <w:sz w:val="19"/>
-        </w:rPr>
-        <w:t>. NIST SP 800-207. https://doi.org/10.6028/NIST.SP.800-207</w:t>
+        <w:t>National Institute of Standards and Technology. (2024). Artificial Intelligence Risk Management Framework Generative Artificial Intelligence Profile (NIST AI 600-1). https://doi.org/10.6028/NIST.AI.600-1</w:t>
       </w:r>
     </w:p>
     <w:p>
       <w:pPr>
         <w:spacing w:after="100"/>
+        <w:ind w:left="317" w:hanging="317"/>
       </w:pPr>
       <w:r>
         <w:rPr>
-          <w:sz w:val="19"/>
+          <w:rFonts w:ascii="Arial" w:hAnsi="Arial"/>
+          <w:b w:val="0"/>
+          <w:i w:val="0"/>
+          <w:color w:val="000000"/>
+          <w:sz w:val="18"/>
         </w:rPr>
-        <w:t xml:space="preserve">[2] Autio, C., et al. (2024). </w:t>
-      </w:r>
-      <w:r>
-        <w:rPr>
-          <w:i/>
-          <w:sz w:val="19"/>
-        </w:rPr>
-        <w:t>Artificial Intelligence Risk Management Framework: Generative Artificial Intelligence Profile</w:t>
-      </w:r>
-      <w:r>
-        <w:rPr>
-          <w:sz w:val="19"/>
-        </w:rPr>
-        <w:t>. NIST AI 600-1. https://doi.org/10.6028/NIST.AI.600-1</w:t>
+        <w:t>Miao, F., &amp; Cukurova, M. (2024). AI competency framework for teachers. UNESCO. https://unesdoc.unesco.org/ark:/48223/pf0000391104</w:t>
       </w:r>
     </w:p>
     <w:p>
       <w:pPr>
         <w:spacing w:after="100"/>
+        <w:ind w:left="317" w:hanging="317"/>
       </w:pPr>
       <w:r>
         <w:rPr>
-          <w:sz w:val="19"/>
+          <w:rFonts w:ascii="Arial" w:hAnsi="Arial"/>
+          <w:b w:val="0"/>
+          <w:i w:val="0"/>
+          <w:color w:val="000000"/>
+          <w:sz w:val="18"/>
         </w:rPr>
-        <w:t xml:space="preserve">[3] OWASP GenAI Security Project (2025). </w:t>
-      </w:r>
-      <w:r>
-        <w:rPr>
-          <w:i/>
-          <w:sz w:val="19"/>
-        </w:rPr>
-        <w:t>OWASP Top 10 for Agentic Applications 2026</w:t>
-      </w:r>
-      <w:r>
-        <w:rPr>
-          <w:sz w:val="19"/>
-        </w:rPr>
-        <w:t>. Published 9 December 2025. https://genai.owasp.org/resource/owasp-top-10-for-agentic-applications-for-2026/</w:t>
+        <w:t>OWASP GenAI Security Project. (2025). OWASP Top 10 for agentic applications 2026. https://genai.owasp.org/resource/owasp-top-10-for-agentic-applications-for-2026/</w:t>
       </w:r>
     </w:p>
     <w:p>
       <w:pPr>
         <w:spacing w:after="100"/>
+        <w:ind w:left="317" w:hanging="317"/>
       </w:pPr>
       <w:r>
         <w:rPr>
-          <w:sz w:val="19"/>
+          <w:rFonts w:ascii="Arial" w:hAnsi="Arial"/>
+          <w:b w:val="0"/>
+          <w:i w:val="0"/>
+          <w:color w:val="000000"/>
+          <w:sz w:val="18"/>
         </w:rPr>
-        <w:t xml:space="preserve">[4] OWASP GenAI Security Project (2026). </w:t>
-      </w:r>
-      <w:r>
-        <w:rPr>
-          <w:i/>
-          <w:sz w:val="19"/>
-        </w:rPr>
-        <w:t>Agent Control Standard (ACS)</w:t>
-      </w:r>
-      <w:r>
-        <w:rPr>
-          <w:sz w:val="19"/>
-        </w:rPr>
-        <w:t>. Resource page published 1 September 2026. https://genai.owasp.org/resource/agent-control-standard-acs/</w:t>
+        <w:t>OWASP GenAI Security Project. (2026). Agent Control Standard. https://genai.owasp.org/resource/agent-control-standard-acs/</w:t>
       </w:r>
     </w:p>
     <w:p>
       <w:pPr>
         <w:spacing w:after="100"/>
+        <w:ind w:left="317" w:hanging="317"/>
       </w:pPr>
       <w:r>
         <w:rPr>
-          <w:sz w:val="19"/>
+          <w:rFonts w:ascii="Arial" w:hAnsi="Arial"/>
+          <w:b w:val="0"/>
+          <w:i w:val="0"/>
+          <w:color w:val="000000"/>
+          <w:sz w:val="18"/>
         </w:rPr>
-        <w:t xml:space="preserve">[5] Apache Software Foundation. </w:t>
-      </w:r>
-      <w:r>
-        <w:rPr>
-          <w:i/>
-          <w:sz w:val="19"/>
-        </w:rPr>
-        <w:t>Apache Kafka 4.1 Documentation: Design</w:t>
-      </w:r>
-      <w:r>
-        <w:rPr>
-          <w:sz w:val="19"/>
-        </w:rPr>
-        <w:t>. https://kafka.apache.org/41/design/design/</w:t>
+        <w:t>Rose, S., Borchert, O., Mitchell, S., &amp; Connelly, S. (2020). Zero Trust Architecture (NIST SP 800-207). National Institute of Standards and Technology. https://doi.org/10.6028/NIST.SP.800-207</w:t>
       </w:r>
     </w:p>
     <w:p>
       <w:pPr>
         <w:spacing w:after="100"/>
+        <w:ind w:left="317" w:hanging="317"/>
       </w:pPr>
       <w:r>
         <w:rPr>
-          <w:sz w:val="19"/>
+          <w:rFonts w:ascii="Arial" w:hAnsi="Arial"/>
+          <w:b w:val="0"/>
+          <w:i w:val="0"/>
+          <w:color w:val="000000"/>
+          <w:sz w:val="18"/>
         </w:rPr>
-        <w:t xml:space="preserve">[6] Apache Software Foundation. </w:t>
-      </w:r>
-      <w:r>
-        <w:rPr>
-          <w:i/>
-          <w:sz w:val="19"/>
-        </w:rPr>
-        <w:t>Apache Iceberg Documentation: Maintenance</w:t>
-      </w:r>
-      <w:r>
-        <w:rPr>
-          <w:sz w:val="19"/>
-        </w:rPr>
-        <w:t>. https://iceberg.apache.org/docs/latest/maintenance/</w:t>
+        <w:t>United Nations. (2024). Global Digital Compact. https://www.un.org/pact-for-the-future/en/annex-i-global-digital-compact</w:t>
       </w:r>
     </w:p>
     <w:p>
       <w:pPr>
-        <w:spacing w:after="100"/>
+        <w:pStyle w:val="Heading1"/>
       </w:pPr>
       <w:r>
-        <w:rPr>
-          <w:sz w:val="19"/>
-        </w:rPr>
-        <w:t xml:space="preserve">[7] UNESCO (2024). </w:t>
-      </w:r>
-      <w:r>
-        <w:rPr>
-          <w:i/>
-          <w:sz w:val="19"/>
-        </w:rPr>
-        <w:t>AI Competency Framework for Teachers</w:t>
-      </w:r>
-      <w:r>
-        <w:rPr>
-          <w:sz w:val="19"/>
-        </w:rPr>
-        <w:t>. https://www.unesco.org/en/articles/ai-competency-framework-teachers</w:t>
+        <w:t>Submission identity fields</w:t>
       </w:r>
     </w:p>
     <w:p>
       <w:pPr>
-        <w:spacing w:after="100"/>
+        <w:pStyle w:val="ListBullet"/>
       </w:pPr>
       <w:r>
         <w:rPr>
-          <w:sz w:val="19"/>
+          <w:rFonts w:ascii="Arial" w:hAnsi="Arial"/>
+          <w:b w:val="0"/>
+          <w:i w:val="0"/>
+          <w:color w:val="000000"/>
+          <w:sz w:val="20"/>
         </w:rPr>
-        <w:t xml:space="preserve">[8] United Nations (2024). </w:t>
-      </w:r>
-      <w:r>
-        <w:rPr>
-          <w:i/>
-          <w:sz w:val="19"/>
-        </w:rPr>
-        <w:t>Global Digital Compact</w:t>
-      </w:r>
-      <w:r>
-        <w:rPr>
-          <w:sz w:val="19"/>
-        </w:rPr>
-        <w:t>. https://www.un.org/pact-for-the-future/en/annex-i-global-digital-compact</w:t>
+        <w:t>Author name: [Confirm full programme name]</w:t>
       </w:r>
     </w:p>
     <w:p>
       <w:pPr>
-        <w:spacing w:after="100"/>
+        <w:pStyle w:val="ListBullet"/>
       </w:pPr>
       <w:r>
         <w:rPr>
-          <w:sz w:val="19"/>
+          <w:rFonts w:ascii="Arial" w:hAnsi="Arial"/>
+          <w:b w:val="0"/>
+          <w:i w:val="0"/>
+          <w:color w:val="000000"/>
+          <w:sz w:val="20"/>
         </w:rPr>
-        <w:t>Web references checked 9 September 2026.</w:t>
+        <w:t>Institutional affiliation: [Confirm]</w:t>
+      </w:r>
+    </w:p>
+    <w:p>
+      <w:pPr>
+        <w:pStyle w:val="ListBullet"/>
+      </w:pPr>
+      <w:r>
+        <w:rPr>
+          <w:rFonts w:ascii="Arial" w:hAnsi="Arial"/>
+          <w:b w:val="0"/>
+          <w:i w:val="0"/>
+          <w:color w:val="000000"/>
+          <w:sz w:val="20"/>
+        </w:rPr>
+        <w:t>Email address: [Confirm]</w:t>
+      </w:r>
+    </w:p>
+    <w:p>
+      <w:pPr>
+        <w:pStyle w:val="ListBullet"/>
+      </w:pPr>
+      <w:r>
+        <w:rPr>
+          <w:rFonts w:ascii="Arial" w:hAnsi="Arial"/>
+          <w:b w:val="0"/>
+          <w:i w:val="0"/>
+          <w:color w:val="000000"/>
+          <w:sz w:val="20"/>
+        </w:rPr>
+        <w:t>Professional role or title: [Confirm]</w:t>
       </w:r>
     </w:p>
     <w:sectPr>
-      <w:pgSz w:w="11906" w:h="16838"/>
-      <w:pgMar w:top="1134" w:right="1191" w:bottom="1134" w:left="1191" w:header="720" w:footer="720" w:gutter="0"/>
+      <w:pgSz w:w="12240" w:h="15840"/>
+      <w:pgMar w:top="1123" w:right="1267" w:bottom="1123" w:left="1267" w:header="720" w:footer="720" w:gutter="0"/>
       <w:cols w:space="720"/>
       <w:docGrid w:linePitch="360"/>
     </w:sectPr>
@@ -823,13 +1115,12 @@
     <w:qFormat/>
     <w:rsid w:val="00FC693F"/>
     <w:pPr>
-      <w:widowControl/>
-      <w:spacing w:line="240" w:lineRule="auto" w:after="80"/>
+      <w:spacing w:after="130" w:line="259" w:lineRule="auto"/>
     </w:pPr>
     <w:rPr>
-      <w:rFonts w:ascii="Times New Roman" w:hAnsi="Times New Roman"/>
+      <w:rFonts w:ascii="Arial" w:hAnsi="Arial"/>
       <w:color w:val="000000"/>
-      <w:sz w:val="22"/>
+      <w:sz w:val="21"/>
     </w:rPr>
   </w:style>
   <w:style w:type="paragraph" w:styleId="Header">
@@ -887,15 +1178,15 @@
     <w:pPr>
       <w:keepNext/>
       <w:keepLines/>
-      <w:spacing w:before="240" w:after="120"/>
+      <w:spacing w:before="240" w:after="100"/>
       <w:outlineLvl w:val="0"/>
     </w:pPr>
     <w:rPr>
-      <w:rFonts w:ascii="Times New Roman" w:hAnsi="Times New Roman"/>
+      <w:rFonts w:asciiTheme="majorHAnsi" w:eastAsiaTheme="majorEastAsia" w:hAnsiTheme="majorHAnsi" w:cstheme="majorBidi" w:ascii="Arial" w:hAnsi="Arial"/>
       <w:b/>
       <w:bCs/>
       <w:color w:val="000000"/>
-      <w:sz w:val="24"/>
+      <w:sz w:val="27"/>
       <w:szCs w:val="28"/>
     </w:rPr>
   </w:style>
@@ -911,15 +1202,15 @@
     <w:pPr>
       <w:keepNext/>
       <w:keepLines/>
-      <w:spacing w:before="200" w:after="0"/>
+      <w:spacing w:before="240" w:after="100"/>
       <w:outlineLvl w:val="1"/>
     </w:pPr>
     <w:rPr>
-      <w:rFonts w:ascii="Times New Roman" w:hAnsi="Times New Roman"/>
+      <w:rFonts w:asciiTheme="majorHAnsi" w:eastAsiaTheme="majorEastAsia" w:hAnsiTheme="majorHAnsi" w:cstheme="majorBidi" w:ascii="Arial" w:hAnsi="Arial"/>
       <w:b/>
       <w:bCs/>
       <w:color w:val="000000"/>
-      <w:sz w:val="26"/>
+      <w:sz w:val="23"/>
       <w:szCs w:val="26"/>
     </w:rPr>
   </w:style>
@@ -1173,17 +1464,16 @@
     <w:qFormat/>
     <w:rsid w:val="00FC693F"/>
     <w:pPr>
-      <w:keepNext/>
-      <w:spacing w:after="100" w:line="240" w:lineRule="auto"/>
+      <w:spacing w:after="240" w:line="240" w:lineRule="auto"/>
       <w:contextualSpacing/>
     </w:pPr>
     <w:rPr>
-      <w:rFonts w:ascii="Times New Roman" w:hAnsi="Times New Roman"/>
+      <w:rFonts w:asciiTheme="majorHAnsi" w:eastAsiaTheme="majorEastAsia" w:hAnsiTheme="majorHAnsi" w:cstheme="majorBidi" w:ascii="Arial" w:hAnsi="Arial"/>
       <w:b/>
       <w:color w:val="000000"/>
       <w:spacing w:val="5"/>
       <w:kern w:val="28"/>
-      <w:sz w:val="40"/>
+      <w:sz w:val="36"/>
       <w:szCs w:val="52"/>
     </w:rPr>
   </w:style>
@@ -1211,19 +1501,17 @@
     <w:qFormat/>
     <w:rsid w:val="00FC693F"/>
     <w:pPr>
-      <w:keepNext/>
       <w:numPr>
         <w:ilvl w:val="1"/>
       </w:numPr>
-      <w:spacing w:after="240"/>
     </w:pPr>
     <w:rPr>
-      <w:rFonts w:ascii="Times New Roman" w:hAnsi="Times New Roman"/>
-      <w:i w:val="0"/>
+      <w:rFonts w:asciiTheme="majorHAnsi" w:eastAsiaTheme="majorEastAsia" w:hAnsiTheme="majorHAnsi" w:cstheme="majorBidi"/>
+      <w:i/>
       <w:iCs/>
-      <w:color w:val="000000"/>
+      <w:color w:val="4F81BD" w:themeColor="accent1"/>
       <w:spacing w:val="15"/>
-      <w:sz w:val="28"/>
+      <w:sz w:val="24"/>
       <w:szCs w:val="24"/>
     </w:rPr>
   </w:style>
@@ -12514,6 +12802,19 @@
         <w:shd w:val="clear" w:color="auto" w:fill="FBCAA2" w:themeFill="accent6" w:themeFillTint="7F"/>
       </w:tcPr>
     </w:tblStylePr>
+  </w:style>
+  <w:style w:type="paragraph" w:customStyle="1" w:styleId="Sectionnote">
+    <w:name w:val="Section note"/>
+    <w:pPr>
+      <w:keepNext/>
+      <w:spacing w:after="100"/>
+    </w:pPr>
+    <w:rPr>
+      <w:rFonts w:ascii="Arial" w:hAnsi="Arial"/>
+      <w:i/>
+      <w:color w:val="464646"/>
+      <w:sz w:val="18"/>
+    </w:rPr>
   </w:style>
 </w:styles>
 </file>

</xml_diff>

<commit_message>
release: strengthen conference evidence and materials
</commit_message>
<xml_diff>
--- a/fssai-ra/docs/extended-abstract.docx
+++ b/fssai-ra/docs/extended-abstract.docx
@@ -8,29 +8,15 @@
         <w:jc w:val="left"/>
       </w:pPr>
       <w:r>
-        <w:rPr>
-          <w:rFonts w:ascii="Arial" w:hAnsi="Arial"/>
-          <w:b/>
-          <w:i w:val="0"/>
-          <w:color w:val="000000"/>
-          <w:sz w:val="36"/>
-        </w:rPr>
-        <w:t>Trust by Construction A Testable Architecture for Sovereign AI Agents in Education</w:t>
+        <w:t>Trust by Construction: A Testable Architecture for Sovereign AI Agents in Education</w:t>
       </w:r>
     </w:p>
     <w:p>
       <w:pPr>
-        <w:spacing w:after="200"/>
+        <w:pStyle w:val="Subtitle"/>
       </w:pPr>
       <w:r>
-        <w:rPr>
-          <w:rFonts w:ascii="Arial" w:hAnsi="Arial"/>
-          <w:b w:val="0"/>
-          <w:i/>
-          <w:color w:val="000000"/>
-          <w:sz w:val="22"/>
-        </w:rPr>
-        <w:t>Extended abstract for the UNU Macau AI Conference 2026</w:t>
+        <w:t>Agentic AI in the Loop From Autonomous Tools to Shared Capacity</w:t>
       </w:r>
     </w:p>
     <w:tbl>
@@ -38,65 +24,61 @@
         <w:tblW w:type="auto" w:w="0"/>
         <w:tblLayout w:type="fixed"/>
         <w:tblLook w:firstColumn="1" w:firstRow="1" w:lastColumn="0" w:lastRow="0" w:noHBand="0" w:noVBand="1" w:val="04A0"/>
-        <w:tblBorders>
-          <w:top w:val="single" w:sz="6" w:color="D9D9D9"/>
-          <w:left w:val="single" w:sz="6" w:color="D9D9D9"/>
-          <w:bottom w:val="single" w:sz="6" w:color="D9D9D9"/>
-          <w:right w:val="single" w:sz="6" w:color="D9D9D9"/>
-          <w:insideH w:val="single" w:sz="6" w:color="D9D9D9"/>
-          <w:insideV w:val="single" w:sz="6" w:color="D9D9D9"/>
-        </w:tblBorders>
       </w:tblPr>
       <w:tblGrid>
-        <w:gridCol w:w="1944"/>
-        <w:gridCol w:w="7632"/>
+        <w:gridCol w:w="4968"/>
+        <w:gridCol w:w="4968"/>
       </w:tblGrid>
       <w:tr>
         <w:tc>
           <w:tcPr>
-            <w:tcW w:type="dxa" w:w="1944"/>
-            <w:vAlign w:val="center"/>
-            <w:tcMar>
-              <w:top w:w="100" w:type="dxa"/>
-              <w:start w:w="120" w:type="dxa"/>
-              <w:bottom w:w="100" w:type="dxa"/>
-              <w:end w:w="120" w:type="dxa"/>
-            </w:tcMar>
+            <w:tcW w:type="dxa" w:w="5040"/>
+            <w:shd w:fill="EEF4F4"/>
           </w:tcPr>
           <w:p>
+            <w:pPr>
+              <w:spacing w:after="0"/>
+            </w:pPr>
             <w:r>
               <w:rPr>
-                <w:rFonts w:ascii="Arial" w:hAnsi="Arial"/>
                 <w:b/>
-                <w:i w:val="0"/>
-                <w:color w:val="000000"/>
+                <w:color w:val="007F7A"/>
+                <w:sz w:val="15"/>
+              </w:rPr>
+              <w:t xml:space="preserve">AUTHOR  </w:t>
+            </w:r>
+            <w:r>
+              <w:rPr>
+                <w:color w:val="273640"/>
                 <w:sz w:val="18"/>
               </w:rPr>
-              <w:t>Proposed panel</w:t>
+              <w:t>[Author name]</w:t>
             </w:r>
           </w:p>
         </w:tc>
         <w:tc>
           <w:tcPr>
-            <w:tcW w:type="dxa" w:w="7632"/>
-            <w:vAlign w:val="center"/>
-            <w:tcMar>
-              <w:top w:w="100" w:type="dxa"/>
-              <w:start w:w="120" w:type="dxa"/>
-              <w:bottom w:w="100" w:type="dxa"/>
-              <w:end w:w="120" w:type="dxa"/>
-            </w:tcMar>
+            <w:tcW w:type="dxa" w:w="5040"/>
+            <w:shd w:fill="EEF4F4"/>
           </w:tcPr>
           <w:p>
+            <w:pPr>
+              <w:spacing w:after="0"/>
+            </w:pPr>
             <w:r>
               <w:rPr>
-                <w:rFonts w:ascii="Arial" w:hAnsi="Arial"/>
-                <w:b w:val="0"/>
-                <w:i w:val="0"/>
-                <w:color w:val="000000"/>
+                <w:b/>
+                <w:color w:val="007F7A"/>
+                <w:sz w:val="15"/>
+              </w:rPr>
+              <w:t xml:space="preserve">AFFILIATION  </w:t>
+            </w:r>
+            <w:r>
+              <w:rPr>
+                <w:color w:val="273640"/>
                 <w:sz w:val="18"/>
               </w:rPr>
-              <w:t>Agentic AI in the Loop From Autonomous Tools to Shared Capacity</w:t>
+              <w:t>[Institutional affiliation]</w:t>
             </w:r>
           </w:p>
         </w:tc>
@@ -104,99 +86,53 @@
       <w:tr>
         <w:tc>
           <w:tcPr>
-            <w:tcW w:type="dxa" w:w="1944"/>
-            <w:vAlign w:val="center"/>
-            <w:tcMar>
-              <w:top w:w="100" w:type="dxa"/>
-              <w:start w:w="120" w:type="dxa"/>
-              <w:bottom w:w="100" w:type="dxa"/>
-              <w:end w:w="120" w:type="dxa"/>
-            </w:tcMar>
+            <w:tcW w:type="dxa" w:w="5040"/>
+            <w:shd w:fill="EEF4F4"/>
           </w:tcPr>
           <w:p>
+            <w:pPr>
+              <w:spacing w:after="0"/>
+            </w:pPr>
             <w:r>
               <w:rPr>
-                <w:rFonts w:ascii="Arial" w:hAnsi="Arial"/>
                 <w:b/>
-                <w:i w:val="0"/>
-                <w:color w:val="000000"/>
+                <w:color w:val="007F7A"/>
+                <w:sz w:val="15"/>
+              </w:rPr>
+              <w:t xml:space="preserve">EMAIL  </w:t>
+            </w:r>
+            <w:r>
+              <w:rPr>
+                <w:color w:val="273640"/>
                 <w:sz w:val="18"/>
               </w:rPr>
-              <w:t>Keywords</w:t>
+              <w:t>[Corresponding email]</w:t>
             </w:r>
           </w:p>
         </w:tc>
         <w:tc>
           <w:tcPr>
-            <w:tcW w:type="dxa" w:w="7632"/>
-            <w:vAlign w:val="center"/>
-            <w:tcMar>
-              <w:top w:w="100" w:type="dxa"/>
-              <w:start w:w="120" w:type="dxa"/>
-              <w:bottom w:w="100" w:type="dxa"/>
-              <w:end w:w="120" w:type="dxa"/>
-            </w:tcMar>
+            <w:tcW w:type="dxa" w:w="5040"/>
+            <w:shd w:fill="EEF4F4"/>
           </w:tcPr>
           <w:p>
+            <w:pPr>
+              <w:spacing w:after="0"/>
+            </w:pPr>
             <w:r>
               <w:rPr>
-                <w:rFonts w:ascii="Arial" w:hAnsi="Arial"/>
-                <w:b w:val="0"/>
-                <w:i w:val="0"/>
-                <w:color w:val="000000"/>
+                <w:b/>
+                <w:color w:val="007F7A"/>
+                <w:sz w:val="15"/>
+              </w:rPr>
+              <w:t xml:space="preserve">ROLE  </w:t>
+            </w:r>
+            <w:r>
+              <w:rPr>
+                <w:color w:val="273640"/>
                 <w:sz w:val="18"/>
               </w:rPr>
-              <w:t>agentic AI, education, institutional sovereignty, fail secure architecture, human oversight, reproducibility, digital public goods</w:t>
-            </w:r>
-          </w:p>
-        </w:tc>
-      </w:tr>
-      <w:tr>
-        <w:tc>
-          <w:tcPr>
-            <w:tcW w:type="dxa" w:w="1944"/>
-            <w:vAlign w:val="center"/>
-            <w:tcMar>
-              <w:top w:w="100" w:type="dxa"/>
-              <w:start w:w="120" w:type="dxa"/>
-              <w:bottom w:w="100" w:type="dxa"/>
-              <w:end w:w="120" w:type="dxa"/>
-            </w:tcMar>
-          </w:tcPr>
-          <w:p>
-            <w:r>
-              <w:rPr>
-                <w:rFonts w:ascii="Arial" w:hAnsi="Arial"/>
-                <w:b/>
-                <w:i w:val="0"/>
-                <w:color w:val="000000"/>
-                <w:sz w:val="18"/>
-              </w:rPr>
-              <w:t>Companion repository</w:t>
-            </w:r>
-          </w:p>
-        </w:tc>
-        <w:tc>
-          <w:tcPr>
-            <w:tcW w:type="dxa" w:w="7632"/>
-            <w:vAlign w:val="center"/>
-            <w:tcMar>
-              <w:top w:w="100" w:type="dxa"/>
-              <w:start w:w="120" w:type="dxa"/>
-              <w:bottom w:w="100" w:type="dxa"/>
-              <w:end w:w="120" w:type="dxa"/>
-            </w:tcMar>
-          </w:tcPr>
-          <w:p>
-            <w:r>
-              <w:rPr>
-                <w:rFonts w:ascii="Arial" w:hAnsi="Arial"/>
-                <w:b w:val="0"/>
-                <w:i w:val="0"/>
-                <w:color w:val="000000"/>
-                <w:sz w:val="18"/>
-              </w:rPr>
-              <w:t>https://github.com/genaiworks/fssai-ra</w:t>
+              <w:t>[Professional role]</w:t>
             </w:r>
           </w:p>
         </w:tc>
@@ -204,8 +140,18 @@
     </w:tbl>
     <w:p>
       <w:pPr>
-        <w:spacing w:after="0"/>
+        <w:pStyle w:val="Metadata"/>
+        <w:spacing w:before="100"/>
       </w:pPr>
+      <w:r>
+        <w:rPr>
+          <w:b/>
+        </w:rPr>
+        <w:t xml:space="preserve">Keywords: </w:t>
+      </w:r>
+      <w:r>
+        <w:t xml:space="preserve">agentic AI, education, institutional sovereignty, fail secure architecture, human oversight, verifiable governance, digital public goods  </w:t>
+      </w:r>
     </w:p>
     <w:p>
       <w:pPr>
@@ -217,62 +163,26 @@
     </w:p>
     <w:p>
       <w:pPr>
-        <w:pStyle w:val="Sectionnote"/>
+        <w:keepLines w:val="0"/>
       </w:pPr>
       <w:r>
-        <w:rPr>
-          <w:rFonts w:ascii="Arial" w:hAnsi="Arial"/>
-          <w:b w:val="0"/>
-          <w:i/>
-          <w:color w:val="000000"/>
-          <w:sz w:val="18"/>
-        </w:rPr>
-        <w:t>Official limit 200 to 250 words  |  Draft count 218 words</w:t>
+        <w:t>A student's support application is refused. She asks who decided, what evidence they saw, and how she can contest the result. An AI agent may have read private records, applied policy, drafted advice, and called an office tool. A malicious instruction in an uploaded file could redirect that workflow. An ordinary model error could cause the same harm. For the student, both produce a result with no clear route back in.</w:t>
       </w:r>
     </w:p>
     <w:p>
       <w:pPr>
-        <w:widowControl/>
+        <w:keepLines w:val="0"/>
       </w:pPr>
       <w:r>
-        <w:rPr>
-          <w:rFonts w:ascii="Arial" w:hAnsi="Arial"/>
-          <w:b w:val="0"/>
-          <w:i w:val="0"/>
-          <w:color w:val="000000"/>
-          <w:sz w:val="21"/>
-        </w:rPr>
-        <w:t>An AI agent helping a university process student support applications may read confidential records, interpret eligibility guidance, draft recommendations, and invoke administrative tools. A malicious instruction in an uploaded document could redirect this workflow; an inaccurate recommendation could also harm a student without any attacker. The institutional question is therefore not only whether the model is trustworthy. It is what the system allows the model to do when it is wrong or compromised, what evidence survives, and how a person can challenge the outcome.</w:t>
+        <w:t>This work asks a narrower, actionable question than whether AI is trustworthy: what stops a wrong or compromised agent from turning its own proposal into institutional authority? It presents Trust by Construction, a fail secure reference architecture for sovereign AI agents in education. Its central rule is that a model may propose an action but cannot create the authority to execute it.</w:t>
       </w:r>
     </w:p>
     <w:p>
       <w:pPr>
-        <w:widowControl/>
+        <w:keepLines w:val="0"/>
       </w:pPr>
       <w:r>
-        <w:rPr>
-          <w:rFonts w:ascii="Arial" w:hAnsi="Arial"/>
-          <w:b w:val="0"/>
-          <w:i w:val="0"/>
-          <w:color w:val="000000"/>
-          <w:sz w:val="21"/>
-        </w:rPr>
-        <w:t>This contribution presents Trust by Construction, a fail secure reference architecture for sovereign agentic AI in education. Sovereignty is defined as an institution's effective control over data access, deployment, keys, policy, operational evidence, and provider exit, rather than local hosting alone. Fail secure means that uncertainty or failure in a required authorization control stops a consequential automated action while a governed manual route preserves access to service.</w:t>
-      </w:r>
-    </w:p>
-    <w:p>
-      <w:pPr>
-        <w:widowControl/>
-      </w:pPr>
-      <w:r>
-        <w:rPr>
-          <w:rFonts w:ascii="Arial" w:hAnsi="Arial"/>
-          <w:b w:val="0"/>
-          <w:i w:val="0"/>
-          <w:color w:val="000000"/>
-          <w:sz w:val="21"/>
-        </w:rPr>
-        <w:t>The original contribution is an executable control contract that connects each governance requirement to seven elements: a protected asset, permitted operation, independent enforcement point, accountable owner, failure test, evidence artifact, and recovery response. Using a synthetic student support workflow and an Apache 2.0 companion repository, the work asks whether this portable contract can contain specified agent failures while preserving useful assistance, review, correction, and institutional learning.</w:t>
+        <w:t>The original contribution is an executable control contract. For every consequential capability, it names the protected asset, allowed operation, enforcement point, owner, failure test, evidence, and recovery response. Sovereignty thus becomes a set of powers an institution can exercise and show: control of access, models, keys, policy, evidence, and provider exit. The aim is to make authority boundaries falsifiable, portable, and useful for learning rather than leaving them as policy promises.</w:t>
       </w:r>
     </w:p>
     <w:p>
@@ -280,112 +190,71 @@
         <w:pStyle w:val="Heading1"/>
       </w:pPr>
       <w:r>
-        <w:t>Development Section 1 Methodology Core Argument and Case Context</w:t>
+        <w:t>Development 1 — Method, core argument, and case context</w:t>
       </w:r>
     </w:p>
     <w:p>
       <w:pPr>
-        <w:pStyle w:val="Sectionnote"/>
+        <w:keepLines w:val="0"/>
       </w:pPr>
       <w:r>
-        <w:rPr>
-          <w:rFonts w:ascii="Arial" w:hAnsi="Arial"/>
-          <w:b w:val="0"/>
-          <w:i/>
-          <w:color w:val="000000"/>
-          <w:sz w:val="18"/>
-        </w:rPr>
-        <w:t>Official limit 550 to 650 words  |  Draft count 646 words</w:t>
+        <w:t>The method joins an education case with executable assurance. It builds on zero trust, the NIST Generative AI Profile, OWASP agent security guidance, ISO IEC 42001, and UNESCO's AI competency framework. It links governance duties to behavior that another institution can test after replacing the original parts.</w:t>
       </w:r>
     </w:p>
     <w:p>
       <w:pPr>
-        <w:widowControl/>
+        <w:keepLines w:val="0"/>
       </w:pPr>
       <w:r>
-        <w:rPr>
-          <w:rFonts w:ascii="Arial" w:hAnsi="Arial"/>
-          <w:b w:val="0"/>
-          <w:i w:val="0"/>
-          <w:color w:val="000000"/>
-          <w:sz w:val="21"/>
-        </w:rPr>
-        <w:t>The method combines established zero trust and AI risk guidance with an education specific workflow, explicit threat assumptions, and executable tests. NIST zero trust architecture rejects implicit trust based on network location and emphasizes authorization around resources (Rose et al., 2020). The NIST Generative AI Profile and OWASP agentic guidance identify risks involving content, tools, identities, goals, and system dependencies (National Institute of Standards and Technology, 2024; OWASP GenAI Security Project, 2025). The emerging OWASP Agent Control Standard provides portable runtime control hooks (OWASP GenAI Security Project, 2026). Trust by Construction does not claim to invent these controls. Its contribution is to integrate governance, enforcement, evidence, recovery, and teaching in a form that institutions can inspect and falsify. Sovereignty becomes operational only when an authority boundary can be named, exercised, failed, and independently evidenced, not merely asserted through hosting location, policy language, or vendor assurance.</w:t>
+        <w:t>The control contract is machine readable, not a prose checklist. A rule fails validation if any of its seven fields is absent, and each check names the rule it defends. This traces a governance claim to code, an observed side effect, a saved record, and the person responsible for recovery. A team starts with one consequential capability and a manual service. It writes the failure test before adding real records or keys. If it cannot name an enforcement point or recovery owner, the capability is not ready for automation.</w:t>
       </w:r>
     </w:p>
     <w:p>
       <w:pPr>
-        <w:widowControl/>
+        <w:keepLines w:val="0"/>
       </w:pPr>
       <w:r>
-        <w:rPr>
-          <w:rFonts w:ascii="Arial" w:hAnsi="Arial"/>
-          <w:b w:val="0"/>
-          <w:i w:val="0"/>
-          <w:color w:val="000000"/>
-          <w:sz w:val="21"/>
-        </w:rPr>
-        <w:t>The illustrative case is deliberately bounded. A student submits synthetic supporting documents. An agent may retrieve records for its assigned case, assemble source passages, and propose moving that case from draft to ready for officer review. It cannot approve an award, broaden its access, delete evidence, or hold the credential used to update the case register. A named officer retains consequential authority, and the student retains an understandable explanation and a route to correction or appeal. The institution remains responsible for eligibility policy, discrimination risks, accessibility, and service quality; the presence of a human approval button does not establish fairness.</w:t>
+        <w:t>This sequence makes the method teachable. Policy, domain, security, and software staff can inspect one shared object, challenge its assumptions, and agree what proof must exist before a pilot begins or expands.</w:t>
       </w:r>
     </w:p>
     <w:p>
       <w:pPr>
-        <w:widowControl/>
+        <w:keepLines w:val="0"/>
       </w:pPr>
       <w:r>
-        <w:rPr>
-          <w:rFonts w:ascii="Arial" w:hAnsi="Arial"/>
-          <w:b w:val="0"/>
-          <w:i w:val="0"/>
-          <w:color w:val="000000"/>
-          <w:sz w:val="21"/>
-        </w:rPr>
-        <w:t>Five functional domains organize the architecture. Controlled import places external documents and updates in quarantine, verifies provenance where available, constrains parsing, and records release. A hardware one way gateway can strengthen directional assurance on a sensitive import link, but it does not make text truthful, remove ordinary language prompt injection, or close maintenance, telemetry, operator, and authorized output paths. Traceable transport assigns stable identifiers and documented ordering scopes, supports replay, and makes missing, duplicate, or out of order events explicit. Reconstructable evidence retains the records, transformations, retrieval configuration, exact passages, model artifact identity, recorded input and output, and policy version used for a decision. A signed manifest identifies retained bytes; it cannot restore deleted data, and exact regeneration of nondeterministic model text is not promised.</w:t>
+        <w:t>The example uses synthetic student support records. An agent may fetch evidence for an assigned case, draft an explanation, and propose moving the case from draft to officer review. It cannot approve an award, widen its access, delete evidence, or hold the key that changes the case register. A named officer retains authority. The student keeps an explanation and a correction or appeal route. The institution remains responsible for policy, access, and fairness.</w:t>
       </w:r>
     </w:p>
     <w:p>
       <w:pPr>
-        <w:widowControl/>
+        <w:keepLines w:val="0"/>
       </w:pPr>
       <w:r>
-        <w:rPr>
-          <w:rFonts w:ascii="Arial" w:hAnsi="Arial"/>
-          <w:b w:val="0"/>
-          <w:i w:val="0"/>
-          <w:color w:val="000000"/>
-          <w:sz w:val="21"/>
-        </w:rPr>
-        <w:t>Bounded assistance gives each agent a case scoped identity, restricted tools, field level retrieval controls, and resource limits. Untrusted content never supplies access labels, approval status, or tool permissions. Accountable action separates proposal from authority. The executor, not the model, holds the write credential. Human approval is bound to a canonical digest covering the operation, target, arguments, evidence version, authoritative case version, audience, and expiry. The executor rechecks current state, rejects altered or stale proposals, records durable intent before mutation, and uses idempotency and reconciliation for interrupted outcomes. Evidence custody is separated from the agent, while an independent verifier checks continuity. These are functional responsibilities, not a mandatory vendor stack.</w:t>
+        <w:t>Five domains organize the design. Controlled import checks source, type, size, schema, and signature before release inward. Its software interface has no read back method and can be replaced by a certified one way data diode. This seam does not prove physical direction, and hardware governs only its stated link. Traceable transport uses stable IDs and replayable events. Evidence preserves the data snapshot, transforms, retrieved text, model ID, proposal, approval, and outcome. Bounded assistance gives each agent a narrow identity and tool set. Accountable action places the write key in an executor outside the model process.</w:t>
       </w:r>
     </w:p>
     <w:p>
       <w:pPr>
-        <w:widowControl/>
+        <w:keepLines w:val="0"/>
       </w:pPr>
       <w:r>
-        <w:rPr>
-          <w:rFonts w:ascii="Arial" w:hAnsi="Arial"/>
-          <w:b w:val="0"/>
-          <w:i w:val="0"/>
-          <w:color w:val="000000"/>
-          <w:sz w:val="21"/>
-        </w:rPr>
-        <w:t>The open teaching profile implements the contract with synthetic records and in memory components. A validated application profile converts permitted operations, state transitions, approval roles, and manual fallback into executor checks; a template lets health, benefits, or justice teams substitute domain language without weakening the method silently. Optional adapters illustrate how teams can evaluate Kafka, Spark, Iceberg, or a local model against the same properties. Separate containers on one shared host demonstrate logical separation only. A compromised host administrator, signing authority, or colluding control owners remains outside the teaching profile's containment claim.</w:t>
+        <w:t>Approval binds to the digest of one proposal: operation, target, arguments, evidence version, resource version, reviewer role, audience, and expiry. The executor checks them and current policy before mutation. It gets the review class from a deployment catalogue, never the model's label. When state and evidence share a database, intent, mutation, receipt, and outcome commit together. External effects still need an outbox, idempotency key, and reconciliation.</w:t>
       </w:r>
     </w:p>
     <w:p>
       <w:pPr>
-        <w:widowControl/>
+        <w:keepLines w:val="0"/>
       </w:pPr>
       <w:r>
-        <w:rPr>
-          <w:rFonts w:ascii="Arial" w:hAnsi="Arial"/>
-          <w:b w:val="0"/>
-          <w:i w:val="0"/>
-          <w:color w:val="000000"/>
-          <w:sz w:val="21"/>
-        </w:rPr>
-        <w:t>Sovereignty is assessed as a set of verifiable capabilities rather than a location label. An institution should be able to identify every operator who can access plaintext, administer its own identities and keys, retain decision evidence under its rules, continue essential service during provider failure, and replace a model or infrastructure provider without losing records or policy control. Physical isolation can strengthen one capability, but ownership of hardware alone does not satisfy the others.</w:t>
+        <w:t>Three declared profiles prevent assurance transfer. Teaching mode runs offline with synthetic data and memory stores. The distributed profile uses authenticated services and exposes health, readiness, metrics, evidence checks, and recovery. A hardware isolated profile adds a physical map, interface list, maintenance process, and independently tested directional gateway. Passing one profile never proves another. A laptop demo cannot be called sovereign production infrastructure, though each profile keeps the same observable contract.</w:t>
+      </w:r>
+    </w:p>
+    <w:p>
+      <w:pPr>
+        <w:keepLines w:val="0"/>
+      </w:pPr>
+      <w:r>
+        <w:t>Three methods address weak hand written tests. Property tests compare generated calls with a separate authorization rule. A bounded model checker lists the declared authority space and checks five invariants. Ablations remove one control to see if harm returns. A portable conformance suite applies the same properties to new backends. The Apache 2.0 repo implements these methods with Python, FastAPI, PostgreSQL, Redis, Kafka, PySpark, Iceberg, S3 storage, Ollama, a React console, a browser worksheet, and extension profiles.</w:t>
       </w:r>
     </w:p>
     <w:p>
@@ -393,112 +262,71 @@
         <w:pStyle w:val="Heading1"/>
       </w:pPr>
       <w:r>
-        <w:t>Development Section 2 Results Analysis and Impact</w:t>
+        <w:t>Development 2 — Results, analysis, and impact</w:t>
       </w:r>
     </w:p>
     <w:p>
       <w:pPr>
-        <w:pStyle w:val="Sectionnote"/>
+        <w:keepLines w:val="0"/>
       </w:pPr>
       <w:r>
-        <w:rPr>
-          <w:rFonts w:ascii="Arial" w:hAnsi="Arial"/>
-          <w:b w:val="0"/>
-          <w:i/>
-          <w:color w:val="000000"/>
-          <w:sz w:val="18"/>
-        </w:rPr>
-        <w:t>Official limit 550 to 650 words  |  Draft count 603 words</w:t>
+        <w:t>All results are fixture observations in declared local settings. They are not security odds, certification, or proof of production readiness. Against the synthetic student support profile, 30 of 30 attacks were contained with zero unauthorized mutations. Six of six benign tasks completed, for a 0.0 false denial rate. Reporting utility beside containment stops a system that refuses everything from looking successful.</w:t>
       </w:r>
     </w:p>
     <w:p>
       <w:pPr>
-        <w:widowControl/>
+        <w:keepLines w:val="0"/>
       </w:pPr>
       <w:r>
-        <w:rPr>
-          <w:rFonts w:ascii="Arial" w:hAnsi="Arial"/>
-          <w:b w:val="0"/>
-          <w:i w:val="0"/>
-          <w:color w:val="000000"/>
-          <w:sz w:val="21"/>
-        </w:rPr>
-        <w:t>At submission, the artifact is a runnable teaching profile and evaluation method, not a production deployment or security certification. In a verified local run on 10 September 2026, all thirty two deterministic contract, adversarial, ablation, profile, recovery, and exact action tests passed. A machine readable report separately recorded containment in eight of eight declared exact action scenarios: valid execution and idempotent retry; altered target and arguments; expired approval; forged reviewer identity; an unallowlisted operation; a profile forbidden transition; and interrupted outcome evidence. The six denial scenarios produced zero unauthorized mutations. The valid retry produced one mutation and one receipt. The interruption produced one mutation, an explicit uncertain status, and one reconciled outcome without duplication. These are fixture observations in a synthetic in memory environment, not estimated security probabilities.</w:t>
+        <w:t>The same seven attacks and valid tasks were applied to three designs. An unguarded model, tool list, and loop contained none and delivered 28 harmful actions. A prompt guarded arm with a safety instruction and per agent tool allowlist contained 29 percent and delivered eight. This baseline is credible because an allowlist stops some attacks. The full design contained all seven and delivered none while completing the same benign work.</w:t>
       </w:r>
     </w:p>
     <w:p>
       <w:pPr>
-        <w:widowControl/>
+        <w:keepLines w:val="0"/>
       </w:pPr>
       <w:r>
-        <w:rPr>
-          <w:rFonts w:ascii="Arial" w:hAnsi="Arial"/>
-          <w:b w:val="0"/>
-          <w:i w:val="0"/>
-          <w:color w:val="000000"/>
-          <w:sz w:val="21"/>
-        </w:rPr>
-        <w:t>The broader evaluation protocol compares three configurations using identical synthetic tasks and starting state: model instructions with broad tools inside a sandbox, the complete declared control configuration, and variants that remove one control at a time. Deterministic malicious requests test enforcement independently of whether a live model happens to follow an attack; separate stochastic trials measure model behavior. Wider scenarios include hostile instructions in retrieved documents, poisoned guidance, unauthorized tool requests, substitution of an unapproved model artifact, attempted evidence modification, policy outage, and executor crashes around an external action. The current pending outcome store is intentionally in memory; production requires a durable outbox committed atomically with the authoritative mutation. A benign set measures whether legitimate assistance remains usable.</w:t>
+        <w:t>The bounded model checker explored 240 states with zero invariant breaks and reached 11 denial controls. It exposed a flaw in the earlier tests. Attacks that changed expiry, audience, or reviewer role hit the signature check first, so later controls were never reached. Using genuine approvals for the wrong proposal, executor, or transition made each claimed denial reachable. The conformance suite also found that the first SQL evidence adapter failed to enforce its write key. Both flaws became regression tests.</w:t>
       </w:r>
     </w:p>
     <w:p>
       <w:pPr>
-        <w:widowControl/>
+        <w:keepLines w:val="0"/>
       </w:pPr>
       <w:r>
-        <w:rPr>
-          <w:rFonts w:ascii="Arial" w:hAnsi="Arial"/>
-          <w:b w:val="0"/>
-          <w:i w:val="0"/>
-          <w:color w:val="000000"/>
-          <w:sz w:val="21"/>
-        </w:rPr>
-        <w:t>For each scenario, evaluation traces the initiating threat, enforcement decision, containment boundary, observable evidence, recovery step, and responsible actor. Primary measures are unauthorized actions completed per attempt, protected canary records disclosed per attempt, legitimate tasks completed, false denials, reconstructable evidence bundles, and unresolved interrupted outcomes. Operational measures include approval delay, reviewer effort, recovery time, and resource consumption. Reviewer exercises test whether staff detect plausible but unsupported recommendations and whether an appeal route produces a usable correction. Results will report denominators, configurations, uncertainty, exclusions, and failures rather than a single security score. Zero observed violations will never be described as zero risk.</w:t>
+        <w:t>Eight of eight ablated controls restored their matching harm, for authority coverage of 1.0. Twenty five conformance checks pass on two backend profiles. A 32 caller race against one approved request produced one mutation, one receipt, one intent, one outcome, and 31 replay replies. This covers one process, not distributed linearizability. In total, 187 deterministic tests run offline. Generated result files keep paper and code figures aligned.</w:t>
       </w:r>
     </w:p>
     <w:p>
       <w:pPr>
-        <w:widowControl/>
+        <w:keepLines w:val="0"/>
       </w:pPr>
       <w:r>
-        <w:rPr>
-          <w:rFonts w:ascii="Arial" w:hAnsi="Arial"/>
-          <w:b w:val="0"/>
-          <w:i w:val="0"/>
-          <w:color w:val="000000"/>
-          <w:sz w:val="21"/>
-        </w:rPr>
-        <w:t>The impact is both practical and educational. For AI for Learning, the approach supports administrative assistance while keeping high impact authority, evidence, and appeal institutionally governed. For Learning for AI, the repository becomes a laboratory: participants identify a trust boundary, attempt a violation, inspect the resulting evidence, remove a control, and recover the service. This advances human agency and critical evaluation emphasized by UNESCO's AI Competency Framework for Teachers (Miao &amp; Cukurova, 2024). Shared tests can build capacity without sharing student data.</w:t>
+        <w:t>The impact serves both halves of the theme. For AI for Learning, the framework supports education services while keeping high impact authority and redress under institutional rule. For Learning for AI, it is a lab: learners mark a boundary, try a violation, inspect refusal and evidence, remove a control, and recover the service. Institutions can share profiles, tests, and recovery patterns without sharing student records. The seven fields also form a supplier question set and adoption checklist for policy, audit, education, and engineering teams.</w:t>
       </w:r>
     </w:p>
     <w:p>
       <w:pPr>
-        <w:widowControl/>
+        <w:keepLines w:val="0"/>
       </w:pPr>
       <w:r>
-        <w:rPr>
-          <w:rFonts w:ascii="Arial" w:hAnsi="Arial"/>
-          <w:b w:val="0"/>
-          <w:i w:val="0"/>
-          <w:color w:val="000000"/>
-          <w:sz w:val="21"/>
-        </w:rPr>
-        <w:t>The release is designed for extension rather than imitation. Contributors begin with one consequential action, write the seven field control contract, implement the enforcement point, add an attack test and a benign test, name the recovery owner, and disclose the assurance profile. A health, benefits, or justice team can replace the educational policy while retaining the method. Teaching, institutional pilot, and hardware isolated profiles carry distinct release gates, preventing a laptop demonstration from being marketed as sovereign production infrastructure. This supports the Global Digital Compact's commitments to digital public goods, capacity building, and interoperable governance while preserving national and institutional choice (United Nations, 2024).</w:t>
+        <w:t>Open questions include a compromised host or signer, attack rates for named models, reviewer accuracy and work, appeal quality, fairness, access, cost, energy, and independent audit. Logical separation on one host does not prove independent trust.</w:t>
       </w:r>
     </w:p>
     <w:p>
       <w:pPr>
-        <w:widowControl/>
+        <w:keepLines w:val="0"/>
       </w:pPr>
       <w:r>
-        <w:rPr>
-          <w:rFonts w:ascii="Arial" w:hAnsi="Arial"/>
-          <w:b w:val="0"/>
-          <w:i w:val="0"/>
-          <w:color w:val="000000"/>
-          <w:sz w:val="21"/>
-        </w:rPr>
-        <w:t>Adoption follows a staged path. Institutions first select one bounded workflow, appoint a service owner, document the manual fallback, and validate local language, accessibility, and record retention requirements. They then measure reviewer workload and student outcomes before expanding autonomy. This sequencing is especially important for resource constrained institutions: right sized local components may reduce recurring dependency, but cost, energy, maintenance, and skills must be measured rather than assumed from deployment location.</w:t>
+        <w:t>The results change how adoption can start. A university, ministry, or civil group can begin with one low volume action and publish its contract, synthetic tests, failure evidence, and exclusions before using personal data. Reviewers can repeat the claims on a disconnected laptop. Engineers can run the suite against their database or event bus. Buyers can ask vendors to show the denial path against the real side effect, not just a policy. Shared tests then travel across borders without pooling data or forcing one vendor stack.</w:t>
+      </w:r>
+    </w:p>
+    <w:p>
+      <w:pPr>
+        <w:keepLines w:val="0"/>
+      </w:pPr>
+      <w:r>
+        <w:t>The evaluation separates containment from decision quality. Exact approval can stop an unapproved change yet let biased advice reach a reviewer. Domain pilots must add outcome, access, bias, and appeal measures to the security properties. They must report reviewer effort and false denials because blocking valid support can harm students. Six benign fixtures show that the reference remains practically usable; they do not prove educational benefit.</w:t>
       </w:r>
     </w:p>
     <w:p>
@@ -511,62 +339,26 @@
     </w:p>
     <w:p>
       <w:pPr>
-        <w:pStyle w:val="Sectionnote"/>
+        <w:keepLines w:val="0"/>
       </w:pPr>
       <w:r>
-        <w:rPr>
-          <w:rFonts w:ascii="Arial" w:hAnsi="Arial"/>
-          <w:b w:val="0"/>
-          <w:i/>
-          <w:color w:val="000000"/>
-          <w:sz w:val="18"/>
-        </w:rPr>
-        <w:t>Official limit 200 to 250 words  |  Draft count 229 words</w:t>
+        <w:t>Trust by Construction changes AI governance from a model promise to a testable boundary around a high impact action. In the student support case, an agent may gather evidence and propose a change, while an authorized person and separate executor decide if that exact change may occur. A changed or stale proposal needs new review. An uncertain result enters reconciliation, not a blind retry. A complete evidence record supports inquiry and appeal.</w:t>
       </w:r>
     </w:p>
     <w:p>
       <w:pPr>
-        <w:widowControl/>
+        <w:keepLines w:val="0"/>
       </w:pPr>
       <w:r>
-        <w:rPr>
-          <w:rFonts w:ascii="Arial" w:hAnsi="Arial"/>
-          <w:b w:val="0"/>
-          <w:i w:val="0"/>
-          <w:color w:val="000000"/>
-          <w:sz w:val="21"/>
-        </w:rPr>
-        <w:t>Trustworthy agentic AI cannot rest on model behavior, certifications, encryption, or human review in isolation. For a consequential workflow, the institution must be able to show where authority resides, which action the approval covers, what happens when a control fails, which evidence survives, and who restores service. Trust by Construction turns those questions into a portable, testable control contract.</w:t>
+        <w:t>Adopters can replace the technology without losing the questions. Each capability must name its protected asset, allowed operation, enforcement point, owner, failure test, evidence, and recovery response. The public repo supplies runnable profiles, attacks, valid tasks, ablations, model checking, conformance tests, a replay race, deployment parts, and extension guidance. A new domain inherits the structure but no assurance claim until its tests pass.</w:t>
       </w:r>
     </w:p>
     <w:p>
       <w:pPr>
-        <w:widowControl/>
+        <w:keepLines w:val="0"/>
       </w:pPr>
       <w:r>
-        <w:rPr>
-          <w:rFonts w:ascii="Arial" w:hAnsi="Arial"/>
-          <w:b w:val="0"/>
-          <w:i w:val="0"/>
-          <w:color w:val="000000"/>
-          <w:sz w:val="21"/>
-        </w:rPr>
-        <w:t>The student support case demonstrates the central rule: an agent may assemble evidence and propose an action, but it cannot convert its own recommendation into institutional authority. A changed proposal requires renewed review. An unavailable authorization service pauses automation. A durable evidence bundle supports investigation, correction, and appeal. These controls contain specified failure paths; they do not guarantee accurate, fair, or beneficial decisions, and they do not erase the need for domain policy, trained reviewers, accessibility, and redress.</w:t>
-      </w:r>
-    </w:p>
-    <w:p>
-      <w:pPr>
-        <w:widowControl/>
-      </w:pPr>
-      <w:r>
-        <w:rPr>
-          <w:rFonts w:ascii="Arial" w:hAnsi="Arial"/>
-          <w:b w:val="0"/>
-          <w:i w:val="0"/>
-          <w:color w:val="000000"/>
-          <w:sz w:val="21"/>
-        </w:rPr>
-        <w:t>The next phase will expand fault injection, stochastic attack trials, reviewer studies, deployment boundary tests, and measured cost and energy reporting. Independent contributors can extend the Apache 2.0 repository at https://github.com/genaiworks/fssai-ra by adding application profiles, domain contracts, adapters, attacks, benign cases, and recovery procedures, then publish comparable JSON results. The practical challenge to every adopting institution is simple: for each consequential agent capability, identify the independent authorization boundary, run a failure test against the real side effect, retain reconstructable evidence, and name the person accountable for recovery.</w:t>
+        <w:t>Future work will test distributed interleavings, named local models under varied attacks, reviewer work, access, fairness, recovery time, cost, and energy. Pilots must test identity control, key custody, backup restore, evidence retention, and every physical link around a data diode. Even a governed agent can apply an unjust rule faster. This design makes decisions attributable and contestable; it does not make policy fair. That bounded contribution helps institutions decide which powers to delegate and when automation must stop.</w:t>
       </w:r>
     </w:p>
     <w:p>
@@ -579,176 +371,101 @@
     </w:p>
     <w:p>
       <w:pPr>
-        <w:spacing w:after="100"/>
-        <w:ind w:left="317" w:hanging="317"/>
+        <w:spacing w:after="60"/>
+        <w:ind w:left="259" w:hanging="259"/>
       </w:pPr>
       <w:r>
-        <w:rPr>
-          <w:rFonts w:ascii="Arial" w:hAnsi="Arial"/>
-          <w:b w:val="0"/>
-          <w:i w:val="0"/>
-          <w:color w:val="000000"/>
-          <w:sz w:val="18"/>
-        </w:rPr>
-        <w:t>National Institute of Standards and Technology. (2024). Artificial Intelligence Risk Management Framework Generative Artificial Intelligence Profile (NIST AI 600-1). https://doi.org/10.6028/NIST.AI.600-1</w:t>
+        <w:t>Autio, C., et al. (2024). Artificial Intelligence Risk Management Framework Generative Artificial Intelligence Profile. NIST AI 600 1. https://doi.org/10.6028/NIST.AI.600-1</w:t>
       </w:r>
     </w:p>
     <w:p>
       <w:pPr>
-        <w:spacing w:after="100"/>
-        <w:ind w:left="317" w:hanging="317"/>
+        <w:spacing w:after="60"/>
+        <w:ind w:left="259" w:hanging="259"/>
       </w:pPr>
       <w:r>
-        <w:rPr>
-          <w:rFonts w:ascii="Arial" w:hAnsi="Arial"/>
-          <w:b w:val="0"/>
-          <w:i w:val="0"/>
-          <w:color w:val="000000"/>
-          <w:sz w:val="18"/>
-        </w:rPr>
-        <w:t>Miao, F., &amp; Cukurova, M. (2024). AI competency framework for teachers. UNESCO. https://unesdoc.unesco.org/ark:/48223/pf0000391104</w:t>
+        <w:t>ISO IEC. (2023). ISO IEC 42001 2023 Information technology Artificial intelligence Management system. https://www.iso.org/standard/81230.html</w:t>
       </w:r>
     </w:p>
     <w:p>
       <w:pPr>
-        <w:spacing w:after="100"/>
-        <w:ind w:left="317" w:hanging="317"/>
+        <w:spacing w:after="60"/>
+        <w:ind w:left="259" w:hanging="259"/>
       </w:pPr>
       <w:r>
-        <w:rPr>
-          <w:rFonts w:ascii="Arial" w:hAnsi="Arial"/>
-          <w:b w:val="0"/>
-          <w:i w:val="0"/>
-          <w:color w:val="000000"/>
-          <w:sz w:val="18"/>
-        </w:rPr>
-        <w:t>OWASP GenAI Security Project. (2025). OWASP Top 10 for agentic applications 2026. https://genai.owasp.org/resource/owasp-top-10-for-agentic-applications-for-2026/</w:t>
+        <w:t>Miao, F., and Cukurova, M. (2024). AI competency framework for teachers. UNESCO. https://unesdoc.unesco.org/ark:/48223/pf0000391104</w:t>
       </w:r>
     </w:p>
     <w:p>
       <w:pPr>
-        <w:spacing w:after="100"/>
-        <w:ind w:left="317" w:hanging="317"/>
+        <w:spacing w:after="60"/>
+        <w:ind w:left="259" w:hanging="259"/>
       </w:pPr>
       <w:r>
-        <w:rPr>
-          <w:rFonts w:ascii="Arial" w:hAnsi="Arial"/>
-          <w:b w:val="0"/>
-          <w:i w:val="0"/>
-          <w:color w:val="000000"/>
-          <w:sz w:val="18"/>
-        </w:rPr>
-        <w:t>OWASP GenAI Security Project. (2026). Agent Control Standard. https://genai.owasp.org/resource/agent-control-standard-acs/</w:t>
+        <w:t>OWASP GenAI Security Project. (2025). OWASP Top 10 for Agentic Applications 2026. https://genai.owasp.org/resource/owasp-top-10-for-agentic-applications-for-2026/</w:t>
       </w:r>
     </w:p>
     <w:p>
       <w:pPr>
-        <w:spacing w:after="100"/>
-        <w:ind w:left="317" w:hanging="317"/>
+        <w:spacing w:after="60"/>
+        <w:ind w:left="259" w:hanging="259"/>
       </w:pPr>
       <w:r>
-        <w:rPr>
-          <w:rFonts w:ascii="Arial" w:hAnsi="Arial"/>
-          <w:b w:val="0"/>
-          <w:i w:val="0"/>
-          <w:color w:val="000000"/>
-          <w:sz w:val="18"/>
-        </w:rPr>
-        <w:t>Rose, S., Borchert, O., Mitchell, S., &amp; Connelly, S. (2020). Zero Trust Architecture (NIST SP 800-207). National Institute of Standards and Technology. https://doi.org/10.6028/NIST.SP.800-207</w:t>
+        <w:t>Rose, S., Borchert, O., Mitchell, S., and Connelly, S. (2020). Zero Trust Architecture. NIST SP 800 207. https://doi.org/10.6028/NIST.SP.800-207</w:t>
       </w:r>
     </w:p>
     <w:p>
       <w:pPr>
-        <w:spacing w:after="100"/>
-        <w:ind w:left="317" w:hanging="317"/>
+        <w:spacing w:after="60"/>
+        <w:ind w:left="259" w:hanging="259"/>
       </w:pPr>
       <w:r>
-        <w:rPr>
-          <w:rFonts w:ascii="Arial" w:hAnsi="Arial"/>
-          <w:b w:val="0"/>
-          <w:i w:val="0"/>
-          <w:color w:val="000000"/>
-          <w:sz w:val="18"/>
-        </w:rPr>
         <w:t>United Nations. (2024). Global Digital Compact. https://www.un.org/pact-for-the-future/en/annex-i-global-digital-compact</w:t>
       </w:r>
     </w:p>
-    <w:p>
-      <w:pPr>
-        <w:pStyle w:val="Heading1"/>
-      </w:pPr>
-      <w:r>
-        <w:t>Submission identity fields</w:t>
-      </w:r>
-    </w:p>
-    <w:p>
-      <w:pPr>
-        <w:pStyle w:val="ListBullet"/>
-      </w:pPr>
-      <w:r>
-        <w:rPr>
-          <w:rFonts w:ascii="Arial" w:hAnsi="Arial"/>
-          <w:b w:val="0"/>
-          <w:i w:val="0"/>
-          <w:color w:val="000000"/>
-          <w:sz w:val="20"/>
-        </w:rPr>
-        <w:t>Author name: [Confirm full programme name]</w:t>
-      </w:r>
-    </w:p>
-    <w:p>
-      <w:pPr>
-        <w:pStyle w:val="ListBullet"/>
-      </w:pPr>
-      <w:r>
-        <w:rPr>
-          <w:rFonts w:ascii="Arial" w:hAnsi="Arial"/>
-          <w:b w:val="0"/>
-          <w:i w:val="0"/>
-          <w:color w:val="000000"/>
-          <w:sz w:val="20"/>
-        </w:rPr>
-        <w:t>Institutional affiliation: [Confirm]</w:t>
-      </w:r>
-    </w:p>
-    <w:p>
-      <w:pPr>
-        <w:pStyle w:val="ListBullet"/>
-      </w:pPr>
-      <w:r>
-        <w:rPr>
-          <w:rFonts w:ascii="Arial" w:hAnsi="Arial"/>
-          <w:b w:val="0"/>
-          <w:i w:val="0"/>
-          <w:color w:val="000000"/>
-          <w:sz w:val="20"/>
-        </w:rPr>
-        <w:t>Email address: [Confirm]</w:t>
-      </w:r>
-    </w:p>
-    <w:p>
-      <w:pPr>
-        <w:pStyle w:val="ListBullet"/>
-      </w:pPr>
-      <w:r>
-        <w:rPr>
-          <w:rFonts w:ascii="Arial" w:hAnsi="Arial"/>
-          <w:b w:val="0"/>
-          <w:i w:val="0"/>
-          <w:color w:val="000000"/>
-          <w:sz w:val="20"/>
-        </w:rPr>
-        <w:t>Professional role or title: [Confirm]</w:t>
-      </w:r>
-    </w:p>
     <w:sectPr>
+      <w:headerReference w:type="default" r:id="rId9"/>
+      <w:footerReference w:type="default" r:id="rId10"/>
       <w:pgSz w:w="12240" w:h="15840"/>
-      <w:pgMar w:top="1123" w:right="1267" w:bottom="1123" w:left="1267" w:header="720" w:footer="720" w:gutter="0"/>
+      <w:pgMar w:top="835" w:right="1080" w:bottom="835" w:left="1080" w:header="720" w:footer="720" w:gutter="0"/>
       <w:cols w:space="720"/>
       <w:docGrid w:linePitch="360"/>
     </w:sectPr>
   </w:body>
 </w:document>
+</file>
+
+<file path=word/footer1.xml><?xml version="1.0" encoding="utf-8"?>
+<w:ftr xmlns:m="http://schemas.openxmlformats.org/officeDocument/2006/math" xmlns:mc="http://schemas.openxmlformats.org/markup-compatibility/2006" xmlns:mo="http://schemas.microsoft.com/office/mac/office/2008/main" xmlns:mv="urn:schemas-microsoft-com:mac:vml" xmlns:o="urn:schemas-microsoft-com:office:office" xmlns:r="http://schemas.openxmlformats.org/officeDocument/2006/relationships" xmlns:v="urn:schemas-microsoft-com:vml" xmlns:w10="urn:schemas-microsoft-com:office:word" xmlns:w14="http://schemas.microsoft.com/office/word/2010/wordml" xmlns:w="http://schemas.openxmlformats.org/wordprocessingml/2006/main" xmlns:wne="http://schemas.microsoft.com/office/word/2006/wordml" xmlns:wp14="http://schemas.microsoft.com/office/word/2010/wordprocessingDrawing" xmlns:wp="http://schemas.openxmlformats.org/drawingml/2006/wordprocessingDrawing" xmlns:wpc="http://schemas.microsoft.com/office/word/2010/wordprocessingCanvas" xmlns:wpg="http://schemas.microsoft.com/office/word/2010/wordprocessingGroup" xmlns:wpi="http://schemas.microsoft.com/office/word/2010/wordprocessingInk" xmlns:wps="http://schemas.microsoft.com/office/word/2010/wordprocessingShape" mc:Ignorable="w14 wp14">
+  <w:p>
+    <w:pPr>
+      <w:pStyle w:val="Footer"/>
+      <w:jc w:val="center"/>
+    </w:pPr>
+    <w:r>
+      <w:rPr>
+        <w:rFonts w:ascii="Arial" w:hAnsi="Arial"/>
+        <w:sz w:val="16"/>
+      </w:rPr>
+      <w:t xml:space="preserve">Trust by Construction  •  </w:t>
+    </w:r>
+    <w:fldSimple w:instr="PAGE"/>
+  </w:p>
+</w:ftr>
+</file>
+
+<file path=word/header1.xml><?xml version="1.0" encoding="utf-8"?>
+<w:hdr xmlns:m="http://schemas.openxmlformats.org/officeDocument/2006/math" xmlns:mc="http://schemas.openxmlformats.org/markup-compatibility/2006" xmlns:mo="http://schemas.microsoft.com/office/mac/office/2008/main" xmlns:mv="urn:schemas-microsoft-com:mac:vml" xmlns:o="urn:schemas-microsoft-com:office:office" xmlns:r="http://schemas.openxmlformats.org/officeDocument/2006/relationships" xmlns:v="urn:schemas-microsoft-com:vml" xmlns:w10="urn:schemas-microsoft-com:office:word" xmlns:w14="http://schemas.microsoft.com/office/word/2010/wordml" xmlns:w="http://schemas.openxmlformats.org/wordprocessingml/2006/main" xmlns:wne="http://schemas.microsoft.com/office/word/2006/wordml" xmlns:wp14="http://schemas.microsoft.com/office/word/2010/wordprocessingDrawing" xmlns:wp="http://schemas.openxmlformats.org/drawingml/2006/wordprocessingDrawing" xmlns:wpc="http://schemas.microsoft.com/office/word/2010/wordprocessingCanvas" xmlns:wpg="http://schemas.microsoft.com/office/word/2010/wordprocessingGroup" xmlns:wpi="http://schemas.microsoft.com/office/word/2010/wordprocessingInk" xmlns:wps="http://schemas.microsoft.com/office/word/2010/wordprocessingShape" mc:Ignorable="w14 wp14">
+  <w:p>
+    <w:pPr>
+      <w:pStyle w:val="Metadata"/>
+      <w:jc w:val="right"/>
+    </w:pPr>
+    <w:r>
+      <w:t>UNU Macau AI Conference 2026  |  Extended Abstract</w:t>
+    </w:r>
+  </w:p>
+</w:hdr>
 </file>
 
 <file path=word/numbering.xml><?xml version="1.0" encoding="utf-8"?>
@@ -1115,12 +832,12 @@
     <w:qFormat/>
     <w:rsid w:val="00FC693F"/>
     <w:pPr>
-      <w:spacing w:after="130" w:line="259" w:lineRule="auto"/>
+      <w:spacing w:after="110" w:line="250" w:lineRule="auto"/>
     </w:pPr>
     <w:rPr>
       <w:rFonts w:ascii="Arial" w:hAnsi="Arial"/>
-      <w:color w:val="000000"/>
-      <w:sz w:val="21"/>
+      <w:color w:val="232B34"/>
+      <w:sz w:val="20"/>
     </w:rPr>
   </w:style>
   <w:style w:type="paragraph" w:styleId="Header">
@@ -1178,15 +895,15 @@
     <w:pPr>
       <w:keepNext/>
       <w:keepLines/>
-      <w:spacing w:before="240" w:after="100"/>
+      <w:spacing w:before="180" w:after="80"/>
       <w:outlineLvl w:val="0"/>
     </w:pPr>
     <w:rPr>
       <w:rFonts w:asciiTheme="majorHAnsi" w:eastAsiaTheme="majorEastAsia" w:hAnsiTheme="majorHAnsi" w:cstheme="majorBidi" w:ascii="Arial" w:hAnsi="Arial"/>
       <w:b/>
       <w:bCs/>
-      <w:color w:val="000000"/>
-      <w:sz w:val="27"/>
+      <w:color w:val="007F7A"/>
+      <w:sz w:val="26"/>
       <w:szCs w:val="28"/>
     </w:rPr>
   </w:style>
@@ -1202,15 +919,15 @@
     <w:pPr>
       <w:keepNext/>
       <w:keepLines/>
-      <w:spacing w:before="240" w:after="100"/>
+      <w:spacing w:before="200" w:after="0"/>
       <w:outlineLvl w:val="1"/>
     </w:pPr>
     <w:rPr>
-      <w:rFonts w:asciiTheme="majorHAnsi" w:eastAsiaTheme="majorEastAsia" w:hAnsiTheme="majorHAnsi" w:cstheme="majorBidi" w:ascii="Arial" w:hAnsi="Arial"/>
+      <w:rFonts w:asciiTheme="majorHAnsi" w:eastAsiaTheme="majorEastAsia" w:hAnsiTheme="majorHAnsi" w:cstheme="majorBidi"/>
       <w:b/>
       <w:bCs/>
-      <w:color w:val="000000"/>
-      <w:sz w:val="23"/>
+      <w:color w:val="4F81BD" w:themeColor="accent1"/>
+      <w:sz w:val="26"/>
       <w:szCs w:val="26"/>
     </w:rPr>
   </w:style>
@@ -1464,16 +1181,18 @@
     <w:qFormat/>
     <w:rsid w:val="00FC693F"/>
     <w:pPr>
-      <w:spacing w:after="240" w:line="240" w:lineRule="auto"/>
+      <w:pBdr>
+        <w:bottom w:val="single" w:sz="8" w:space="4" w:color="4F81BD" w:themeColor="accent1"/>
+      </w:pBdr>
+      <w:spacing w:after="300" w:line="240" w:lineRule="auto"/>
       <w:contextualSpacing/>
     </w:pPr>
     <w:rPr>
       <w:rFonts w:asciiTheme="majorHAnsi" w:eastAsiaTheme="majorEastAsia" w:hAnsiTheme="majorHAnsi" w:cstheme="majorBidi" w:ascii="Arial" w:hAnsi="Arial"/>
-      <w:b/>
-      <w:color w:val="000000"/>
+      <w:color w:val="12314A"/>
       <w:spacing w:val="5"/>
       <w:kern w:val="28"/>
-      <w:sz w:val="36"/>
+      <w:sz w:val="46"/>
       <w:szCs w:val="52"/>
     </w:rPr>
   </w:style>
@@ -1506,12 +1225,12 @@
       </w:numPr>
     </w:pPr>
     <w:rPr>
-      <w:rFonts w:asciiTheme="majorHAnsi" w:eastAsiaTheme="majorEastAsia" w:hAnsiTheme="majorHAnsi" w:cstheme="majorBidi"/>
+      <w:rFonts w:asciiTheme="majorHAnsi" w:eastAsiaTheme="majorEastAsia" w:hAnsiTheme="majorHAnsi" w:cstheme="majorBidi" w:ascii="Arial" w:hAnsi="Arial"/>
       <w:i/>
       <w:iCs/>
-      <w:color w:val="4F81BD" w:themeColor="accent1"/>
+      <w:color w:val="3C6478"/>
       <w:spacing w:val="15"/>
-      <w:sz w:val="24"/>
+      <w:sz w:val="22"/>
       <w:szCs w:val="24"/>
     </w:rPr>
   </w:style>
@@ -12803,16 +12522,14 @@
       </w:tcPr>
     </w:tblStylePr>
   </w:style>
-  <w:style w:type="paragraph" w:customStyle="1" w:styleId="Sectionnote">
-    <w:name w:val="Section note"/>
-    <w:pPr>
-      <w:keepNext/>
-      <w:spacing w:after="100"/>
+  <w:style w:type="paragraph" w:customStyle="1" w:styleId="Metadata">
+    <w:name w:val="Metadata"/>
+    <w:pPr>
+      <w:spacing w:after="40"/>
     </w:pPr>
     <w:rPr>
       <w:rFonts w:ascii="Arial" w:hAnsi="Arial"/>
-      <w:i/>
-      <w:color w:val="464646"/>
+      <w:color w:val="526472"/>
       <w:sz w:val="18"/>
     </w:rPr>
   </w:style>

</xml_diff>

<commit_message>
make documentation navigable by policy and engineering roles
</commit_message>
<xml_diff>
--- a/fssai-ra/docs/extended-abstract.docx
+++ b/fssai-ra/docs/extended-abstract.docx
@@ -8,15 +8,29 @@
         <w:jc w:val="left"/>
       </w:pPr>
       <w:r>
-        <w:t>Trust by Construction: A Testable Architecture for Sovereign AI Agents in Education</w:t>
+        <w:rPr>
+          <w:rFonts w:ascii="Arial" w:hAnsi="Arial"/>
+          <w:b/>
+          <w:i w:val="0"/>
+          <w:color w:val="000000"/>
+          <w:sz w:val="36"/>
+        </w:rPr>
+        <w:t>From Model Literacy to System Literacy: Teaching Trust by Construction for Agentic AI</w:t>
       </w:r>
     </w:p>
     <w:p>
       <w:pPr>
-        <w:pStyle w:val="Subtitle"/>
+        <w:spacing w:after="200"/>
       </w:pPr>
       <w:r>
-        <w:t>Agentic AI in the Loop From Autonomous Tools to Shared Capacity</w:t>
+        <w:rPr>
+          <w:rFonts w:ascii="Arial" w:hAnsi="Arial"/>
+          <w:b w:val="0"/>
+          <w:i/>
+          <w:color w:val="000000"/>
+          <w:sz w:val="22"/>
+        </w:rPr>
+        <w:t>Extended abstract for the UNU Macau AI Conference 2026</w:t>
       </w:r>
     </w:p>
     <w:tbl>
@@ -24,61 +38,65 @@
         <w:tblW w:type="auto" w:w="0"/>
         <w:tblLayout w:type="fixed"/>
         <w:tblLook w:firstColumn="1" w:firstRow="1" w:lastColumn="0" w:lastRow="0" w:noHBand="0" w:noVBand="1" w:val="04A0"/>
+        <w:tblBorders>
+          <w:top w:val="single" w:sz="6" w:color="D9D9D9"/>
+          <w:left w:val="single" w:sz="6" w:color="D9D9D9"/>
+          <w:bottom w:val="single" w:sz="6" w:color="D9D9D9"/>
+          <w:right w:val="single" w:sz="6" w:color="D9D9D9"/>
+          <w:insideH w:val="single" w:sz="6" w:color="D9D9D9"/>
+          <w:insideV w:val="single" w:sz="6" w:color="D9D9D9"/>
+        </w:tblBorders>
       </w:tblPr>
       <w:tblGrid>
-        <w:gridCol w:w="4968"/>
-        <w:gridCol w:w="4968"/>
+        <w:gridCol w:w="1944"/>
+        <w:gridCol w:w="7632"/>
       </w:tblGrid>
       <w:tr>
         <w:tc>
           <w:tcPr>
-            <w:tcW w:type="dxa" w:w="5040"/>
-            <w:shd w:fill="EEF4F4"/>
+            <w:tcW w:type="dxa" w:w="1944"/>
+            <w:vAlign w:val="center"/>
+            <w:tcMar>
+              <w:top w:w="100" w:type="dxa"/>
+              <w:start w:w="120" w:type="dxa"/>
+              <w:bottom w:w="100" w:type="dxa"/>
+              <w:end w:w="120" w:type="dxa"/>
+            </w:tcMar>
           </w:tcPr>
           <w:p>
-            <w:pPr>
-              <w:spacing w:after="0"/>
-            </w:pPr>
             <w:r>
               <w:rPr>
+                <w:rFonts w:ascii="Arial" w:hAnsi="Arial"/>
                 <w:b/>
-                <w:color w:val="007F7A"/>
-                <w:sz w:val="15"/>
-              </w:rPr>
-              <w:t xml:space="preserve">AUTHOR  </w:t>
-            </w:r>
-            <w:r>
-              <w:rPr>
-                <w:color w:val="273640"/>
+                <w:i w:val="0"/>
+                <w:color w:val="000000"/>
                 <w:sz w:val="18"/>
               </w:rPr>
-              <w:t>[Author name]</w:t>
+              <w:t>Proposed panel</w:t>
             </w:r>
           </w:p>
         </w:tc>
         <w:tc>
           <w:tcPr>
-            <w:tcW w:type="dxa" w:w="5040"/>
-            <w:shd w:fill="EEF4F4"/>
+            <w:tcW w:type="dxa" w:w="7632"/>
+            <w:vAlign w:val="center"/>
+            <w:tcMar>
+              <w:top w:w="100" w:type="dxa"/>
+              <w:start w:w="120" w:type="dxa"/>
+              <w:bottom w:w="100" w:type="dxa"/>
+              <w:end w:w="120" w:type="dxa"/>
+            </w:tcMar>
           </w:tcPr>
           <w:p>
-            <w:pPr>
-              <w:spacing w:after="0"/>
-            </w:pPr>
             <w:r>
               <w:rPr>
-                <w:b/>
-                <w:color w:val="007F7A"/>
-                <w:sz w:val="15"/>
-              </w:rPr>
-              <w:t xml:space="preserve">AFFILIATION  </w:t>
-            </w:r>
-            <w:r>
-              <w:rPr>
-                <w:color w:val="273640"/>
+                <w:rFonts w:ascii="Arial" w:hAnsi="Arial"/>
+                <w:b w:val="0"/>
+                <w:i w:val="0"/>
+                <w:color w:val="000000"/>
                 <w:sz w:val="18"/>
               </w:rPr>
-              <w:t>[Institutional affiliation]</w:t>
+              <w:t>Agentic AI in the Loop - From Autonomous Tools to Shared Capacity</w:t>
             </w:r>
           </w:p>
         </w:tc>
@@ -86,53 +104,99 @@
       <w:tr>
         <w:tc>
           <w:tcPr>
-            <w:tcW w:type="dxa" w:w="5040"/>
-            <w:shd w:fill="EEF4F4"/>
+            <w:tcW w:type="dxa" w:w="1944"/>
+            <w:vAlign w:val="center"/>
+            <w:tcMar>
+              <w:top w:w="100" w:type="dxa"/>
+              <w:start w:w="120" w:type="dxa"/>
+              <w:bottom w:w="100" w:type="dxa"/>
+              <w:end w:w="120" w:type="dxa"/>
+            </w:tcMar>
           </w:tcPr>
           <w:p>
-            <w:pPr>
-              <w:spacing w:after="0"/>
-            </w:pPr>
             <w:r>
               <w:rPr>
+                <w:rFonts w:ascii="Arial" w:hAnsi="Arial"/>
                 <w:b/>
-                <w:color w:val="007F7A"/>
-                <w:sz w:val="15"/>
-              </w:rPr>
-              <w:t xml:space="preserve">EMAIL  </w:t>
-            </w:r>
-            <w:r>
-              <w:rPr>
-                <w:color w:val="273640"/>
+                <w:i w:val="0"/>
+                <w:color w:val="000000"/>
                 <w:sz w:val="18"/>
               </w:rPr>
-              <w:t>[Corresponding email]</w:t>
+              <w:t>Keywords</w:t>
             </w:r>
           </w:p>
         </w:tc>
         <w:tc>
           <w:tcPr>
-            <w:tcW w:type="dxa" w:w="5040"/>
-            <w:shd w:fill="EEF4F4"/>
+            <w:tcW w:type="dxa" w:w="7632"/>
+            <w:vAlign w:val="center"/>
+            <w:tcMar>
+              <w:top w:w="100" w:type="dxa"/>
+              <w:start w:w="120" w:type="dxa"/>
+              <w:bottom w:w="100" w:type="dxa"/>
+              <w:end w:w="120" w:type="dxa"/>
+            </w:tcMar>
           </w:tcPr>
           <w:p>
-            <w:pPr>
-              <w:spacing w:after="0"/>
-            </w:pPr>
             <w:r>
               <w:rPr>
-                <w:b/>
-                <w:color w:val="007F7A"/>
-                <w:sz w:val="15"/>
+                <w:rFonts w:ascii="Arial" w:hAnsi="Arial"/>
+                <w:b w:val="0"/>
+                <w:i w:val="0"/>
+                <w:color w:val="000000"/>
+                <w:sz w:val="18"/>
               </w:rPr>
-              <w:t xml:space="preserve">ROLE  </w:t>
+              <w:t>agentic AI; educational administration; institutional sovereignty; fail-secure architecture; human oversight; verifiable governance; digital public goods</w:t>
             </w:r>
+          </w:p>
+        </w:tc>
+      </w:tr>
+      <w:tr>
+        <w:tc>
+          <w:tcPr>
+            <w:tcW w:type="dxa" w:w="1944"/>
+            <w:vAlign w:val="center"/>
+            <w:tcMar>
+              <w:top w:w="100" w:type="dxa"/>
+              <w:start w:w="120" w:type="dxa"/>
+              <w:bottom w:w="100" w:type="dxa"/>
+              <w:end w:w="120" w:type="dxa"/>
+            </w:tcMar>
+          </w:tcPr>
+          <w:p>
             <w:r>
               <w:rPr>
-                <w:color w:val="273640"/>
+                <w:rFonts w:ascii="Arial" w:hAnsi="Arial"/>
+                <w:b/>
+                <w:i w:val="0"/>
+                <w:color w:val="000000"/>
                 <w:sz w:val="18"/>
               </w:rPr>
-              <w:t>[Professional role]</w:t>
+              <w:t>Reference implementation</w:t>
+            </w:r>
+          </w:p>
+        </w:tc>
+        <w:tc>
+          <w:tcPr>
+            <w:tcW w:type="dxa" w:w="7632"/>
+            <w:vAlign w:val="center"/>
+            <w:tcMar>
+              <w:top w:w="100" w:type="dxa"/>
+              <w:start w:w="120" w:type="dxa"/>
+              <w:bottom w:w="100" w:type="dxa"/>
+              <w:end w:w="120" w:type="dxa"/>
+            </w:tcMar>
+          </w:tcPr>
+          <w:p>
+            <w:r>
+              <w:rPr>
+                <w:rFonts w:ascii="Arial" w:hAnsi="Arial"/>
+                <w:b w:val="0"/>
+                <w:i w:val="0"/>
+                <w:color w:val="000000"/>
+                <w:sz w:val="18"/>
+              </w:rPr>
+              <w:t>https://github.com/genaiworks/fssai-ra (release v1.0.0 for baseline figures, plus current-source supplements; record the reviewed commit at submission)</w:t>
             </w:r>
           </w:p>
         </w:tc>
@@ -140,18 +204,8 @@
     </w:tbl>
     <w:p>
       <w:pPr>
-        <w:pStyle w:val="Metadata"/>
-        <w:spacing w:before="100"/>
+        <w:spacing w:after="0"/>
       </w:pPr>
-      <w:r>
-        <w:rPr>
-          <w:b/>
-        </w:rPr>
-        <w:t xml:space="preserve">Keywords: </w:t>
-      </w:r>
-      <w:r>
-        <w:t xml:space="preserve">agentic AI, education, institutional sovereignty, fail secure architecture, human oversight, verifiable governance, digital public goods  </w:t>
-      </w:r>
     </w:p>
     <w:p>
       <w:pPr>
@@ -163,26 +217,81 @@
     </w:p>
     <w:p>
       <w:pPr>
-        <w:keepLines w:val="0"/>
+        <w:pStyle w:val="Sectionnote"/>
       </w:pPr>
       <w:r>
-        <w:t>A student's support application is refused. She asks who decided, what evidence they saw, and how she can contest the result. An AI agent may have read private records, applied policy, drafted advice, and called an office tool. A malicious instruction in an uploaded file could redirect that workflow. An ordinary model error could cause the same harm. For the student, both produce a result with no clear route back in.</w:t>
+        <w:rPr>
+          <w:rFonts w:ascii="Arial" w:hAnsi="Arial"/>
+          <w:b w:val="0"/>
+          <w:i/>
+          <w:color w:val="000000"/>
+          <w:sz w:val="18"/>
+        </w:rPr>
+        <w:t>Official limit 200 to 250 words  |  Draft count 237 words</w:t>
       </w:r>
     </w:p>
     <w:p>
       <w:pPr>
-        <w:keepLines w:val="0"/>
+        <w:keepLines/>
+        <w:widowControl/>
       </w:pPr>
       <w:r>
-        <w:t>This work asks a narrower, actionable question than whether AI is trustworthy: what stops a wrong or compromised agent from turning its own proposal into institutional authority? It presents Trust by Construction, a fail secure reference architecture for sovereign AI agents in education. Its central rule is that a model may propose an action but cannot create the authority to execute it.</w:t>
+        <w:rPr>
+          <w:rFonts w:ascii="Arial" w:hAnsi="Arial"/>
+          <w:b w:val="0"/>
+          <w:i w:val="0"/>
+          <w:color w:val="000000"/>
+          <w:sz w:val="21"/>
+        </w:rPr>
+        <w:t>A student's support application is refused. She asks who decided, what they saw, and how she can contest it. Somewhere in that process an agent read her file, applied policy, drafted a recommendation, and called an administrative tool. A malicious instruction hidden in an uploaded file could have redirected it. So could an ordinary model error, with no attacker. From where she stands the two are the same: an outcome, and no way back in.</w:t>
       </w:r>
     </w:p>
     <w:p>
       <w:pPr>
-        <w:keepLines w:val="0"/>
+        <w:keepLines/>
+        <w:widowControl/>
       </w:pPr>
       <w:r>
-        <w:t>The original contribution is an executable control contract. For every consequential capability, it names the protected asset, allowed operation, enforcement point, owner, failure test, evidence, and recovery response. Sovereignty thus becomes a set of powers an institution can exercise and show: control of access, models, keys, policy, evidence, and provider exit. The aim is to make authority boundaries falsifiable, portable, and useful for learning rather than leaving them as policy promises.</w:t>
+        <w:rPr>
+          <w:rFonts w:ascii="Arial" w:hAnsi="Arial"/>
+          <w:b w:val="0"/>
+          <w:i w:val="0"/>
+          <w:color w:val="000000"/>
+          <w:sz w:val="21"/>
+        </w:rPr>
+        <w:t>This work asks a narrower question than whether AI is trustworthy: what stops a wrong or compromised agent from turning its own proposal into institutional authority? It presents Trust by Construction, a fail-secure architecture for sovereign AI agents in education. Its central rule is one sentence: a model may propose an action; it cannot manufacture the authority to execute it.</w:t>
+      </w:r>
+    </w:p>
+    <w:p>
+      <w:pPr>
+        <w:keepLines/>
+        <w:widowControl/>
+      </w:pPr>
+      <w:r>
+        <w:rPr>
+          <w:rFonts w:ascii="Arial" w:hAnsi="Arial"/>
+          <w:b w:val="0"/>
+          <w:i w:val="0"/>
+          <w:color w:val="000000"/>
+          <w:sz w:val="21"/>
+        </w:rPr>
+        <w:t>The contribution is an executable control contract. For every consequential capability it names the protected asset, permitted operation, enforcement point, accountable owner, failure test, evidence artifact, and recovery response. It turns system literacy from vocabulary into something a learner can demonstrate.</w:t>
+      </w:r>
+    </w:p>
+    <w:p>
+      <w:pPr>
+        <w:keepLines/>
+        <w:widowControl/>
+      </w:pPr>
+      <w:r>
+        <w:rPr>
+          <w:rFonts w:ascii="Arial" w:hAnsi="Arial"/>
+          <w:b w:val="0"/>
+          <w:i w:val="0"/>
+          <w:color w:val="000000"/>
+          <w:sz w:val="21"/>
+        </w:rPr>
+        <w:t>The argument I bring to the panel goes further. Institutions are being sold autonomy and told to add a human. Human oversight is not a safeguard bolted on afterwards; it is a finite resource with a ceiling an institution can calculate, and above that ceiling "a human approved it" stops being true while every audit log continues to say it is.</w:t>
       </w:r>
     </w:p>
     <w:p>
@@ -190,71 +299,150 @@
         <w:pStyle w:val="Heading1"/>
       </w:pPr>
       <w:r>
-        <w:t>Development 1 — Method, core argument, and case context</w:t>
+        <w:t>Development Section 1 Methodology Core Argument and Case Context</w:t>
       </w:r>
     </w:p>
     <w:p>
       <w:pPr>
-        <w:keepLines w:val="0"/>
+        <w:pStyle w:val="Sectionnote"/>
       </w:pPr>
       <w:r>
-        <w:t>The method joins an education case with executable assurance. It builds on zero trust, the NIST Generative AI Profile, OWASP agent security guidance, ISO IEC 42001, and UNESCO's AI competency framework. It links governance duties to behavior that another institution can test after replacing the original parts.</w:t>
+        <w:rPr>
+          <w:rFonts w:ascii="Arial" w:hAnsi="Arial"/>
+          <w:b w:val="0"/>
+          <w:i/>
+          <w:color w:val="000000"/>
+          <w:sz w:val="18"/>
+        </w:rPr>
+        <w:t>Official limit 550 to 650 words  |  Draft count 551 words</w:t>
       </w:r>
     </w:p>
     <w:p>
       <w:pPr>
-        <w:keepLines w:val="0"/>
+        <w:keepLines/>
+        <w:widowControl/>
       </w:pPr>
       <w:r>
-        <w:t>The control contract is machine readable, not a prose checklist. A rule fails validation if any of its seven fields is absent, and each check names the rule it defends. This traces a governance claim to code, an observed side effect, a saved record, and the person responsible for recovery. A team starts with one consequential capability and a manual service. It writes the failure test before adding real records or keys. If it cannot name an enforcement point or recovery owner, the capability is not ready for automation.</w:t>
+        <w:rPr>
+          <w:rFonts w:ascii="Arial" w:hAnsi="Arial"/>
+          <w:b w:val="0"/>
+          <w:i w:val="0"/>
+          <w:color w:val="000000"/>
+          <w:sz w:val="21"/>
+        </w:rPr>
+        <w:t>The method joins an education case with executable assurance, informed by zero trust, NIST, OWASP, ISO/IEC 42001, and UNESCO's AI competency framework. Each governance duty becomes behaviour another institution can test after replacing parts.</w:t>
       </w:r>
     </w:p>
     <w:p>
       <w:pPr>
-        <w:keepLines w:val="0"/>
+        <w:keepLines/>
+        <w:widowControl/>
       </w:pPr>
       <w:r>
-        <w:t>This sequence makes the method teachable. Policy, domain, security, and software staff can inspect one shared object, challenge its assumptions, and agree what proof must exist before a pilot begins or expands.</w:t>
+        <w:rPr>
+          <w:rFonts w:ascii="Arial" w:hAnsi="Arial"/>
+          <w:b w:val="0"/>
+          <w:i w:val="0"/>
+          <w:color w:val="000000"/>
+          <w:sz w:val="21"/>
+        </w:rPr>
+        <w:t>The control contract is machine-readable. Its seven fields are mandatory, and each check names the requirement it defends. Teams begin with one consequential capability and manual fallback, writing the failure test before connecting real records or keys. If the fields cannot be filled, nobody is ready to automate it.</w:t>
       </w:r>
     </w:p>
     <w:p>
       <w:pPr>
-        <w:keepLines w:val="0"/>
+        <w:keepLines/>
+        <w:widowControl/>
       </w:pPr>
       <w:r>
-        <w:t>The example uses synthetic student support records. An agent may fetch evidence for an assigned case, draft an explanation, and propose moving the case from draft to officer review. It cannot approve an award, widen its access, delete evidence, or hold the key that changes the case register. A named officer retains authority. The student keeps an explanation and a correction or appeal route. The institution remains responsible for policy, access, and fairness.</w:t>
+        <w:rPr>
+          <w:rFonts w:ascii="Arial" w:hAnsi="Arial"/>
+          <w:b w:val="0"/>
+          <w:i w:val="0"/>
+          <w:color w:val="000000"/>
+          <w:sz w:val="21"/>
+        </w:rPr>
+        <w:t>This becomes five-part system literacy: trace data and versions; distinguish proposals from delegated powers; verify controls independently of the model; make escalation capacity explicit; and reconstruct accountability through a correction route. Learners produce artifacts or failures for each, not definitions. Each learner must also state the limit of the evidence they produce.</w:t>
       </w:r>
     </w:p>
     <w:p>
       <w:pPr>
-        <w:keepLines w:val="0"/>
+        <w:keepLines/>
+        <w:widowControl/>
       </w:pPr>
       <w:r>
-        <w:t>Five domains organize the design. Controlled import checks source, type, size, schema, and signature before release inward. Its software interface has no read back method and can be replaced by a certified one way data diode. This seam does not prove physical direction, and hardware governs only its stated link. Traceable transport uses stable IDs and replayable events. Evidence preserves the data snapshot, transforms, retrieved text, model ID, proposal, approval, and outcome. Bounded assistance gives each agent a narrow identity and tool set. Accountable action places the write key in an executor outside the model process.</w:t>
+        <w:rPr>
+          <w:rFonts w:ascii="Arial" w:hAnsi="Arial"/>
+          <w:b w:val="0"/>
+          <w:i w:val="0"/>
+          <w:color w:val="000000"/>
+          <w:sz w:val="21"/>
+        </w:rPr>
+        <w:t>The reference case uses synthetic student-support records. An agent may fetch evidence for an assigned case, draft an explanation, and propose moving it from draft to officer review. It cannot approve an award, widen its own access, delete evidence, or hold the key that changes the case register. A named officer retains authority, and the institution remains responsible for policy and fairness.</w:t>
       </w:r>
     </w:p>
     <w:p>
       <w:pPr>
-        <w:keepLines w:val="0"/>
+        <w:keepLines/>
+        <w:widowControl/>
       </w:pPr>
       <w:r>
-        <w:t>Approval binds to the digest of one proposal: operation, target, arguments, evidence version, resource version, reviewer role, audience, and expiry. The executor checks them and current policy before mutation. It gets the review class from a deployment catalogue, never the model's label. When state and evidence share a database, intent, mutation, receipt, and outcome commit together. External effects still need an outbox, idempotency key, and reconciliation.</w:t>
+        <w:rPr>
+          <w:rFonts w:ascii="Arial" w:hAnsi="Arial"/>
+          <w:b w:val="0"/>
+          <w:i w:val="0"/>
+          <w:color w:val="000000"/>
+          <w:sz w:val="21"/>
+        </w:rPr>
+        <w:t>Five domains organise the design. Controlled import validates source, type, size, schema, and signature through a no-read-back software seam a certified diode can replace. Transport uses stable identifiers and replayable events. Reproducible data preserves snapshots, transforms, retrieved text, model identity, proposal, approval, and outcome. Bounded intelligence narrows identity and tools. Accountable action keeps the write credential outside the model process.</w:t>
       </w:r>
     </w:p>
     <w:p>
       <w:pPr>
-        <w:keepLines w:val="0"/>
+        <w:keepLines/>
+        <w:widowControl/>
       </w:pPr>
       <w:r>
-        <w:t>Three declared profiles prevent assurance transfer. Teaching mode runs offline with synthetic data and memory stores. The distributed profile uses authenticated services and exposes health, readiness, metrics, evidence checks, and recovery. A hardware isolated profile adds a physical map, interface list, maintenance process, and independently tested directional gateway. Passing one profile never proves another. A laptop demo cannot be called sovereign production infrastructure, though each profile keeps the same observable contract.</w:t>
+        <w:rPr>
+          <w:rFonts w:ascii="Arial" w:hAnsi="Arial"/>
+          <w:b w:val="0"/>
+          <w:i w:val="0"/>
+          <w:color w:val="000000"/>
+          <w:sz w:val="21"/>
+        </w:rPr>
+        <w:t>An approval binds to a proposal digest covering the operation, target, states, evidence version, requester, and resource version, with the reviewer role, audience, and expiry also authenticated. The executor rechecks every field before mutation and reads the review class from a deployment catalogue, never from the model's own label.</w:t>
       </w:r>
     </w:p>
     <w:p>
       <w:pPr>
-        <w:keepLines w:val="0"/>
+        <w:keepLines/>
+        <w:widowControl/>
       </w:pPr>
       <w:r>
-        <w:t>Three methods address weak hand written tests. Property tests compare generated calls with a separate authorization rule. A bounded model checker lists the declared authority space and checks five invariants. Ablations remove one control to see if harm returns. A portable conformance suite applies the same properties to new backends. The Apache 2.0 repo implements these methods with Python, FastAPI, PostgreSQL, Redis, Kafka, PySpark, Iceberg, S3 storage, Ollama, a React console, a browser worksheet, and extension profiles.</w:t>
+        <w:rPr>
+          <w:rFonts w:ascii="Arial" w:hAnsi="Arial"/>
+          <w:b w:val="0"/>
+          <w:i w:val="0"/>
+          <w:color w:val="000000"/>
+          <w:sz w:val="21"/>
+        </w:rPr>
+        <w:t>Two additions answer questions this architecture previously could not. First, review load is modelled as a scarce safety-relevant resource: a declared capacity per reviewer per window, a deliberation floor below which an approval is refused rather than flagged, mandatory escalation to a second reviewer under sustained load, and a published measure of remaining headroom. Refusing to issue the approval, rather than recording a concern afterwards, is what makes this a control instead of a dashboard. Second, because every result had been measured on the one profile the architecture was designed around, a structurally different education domain was added through the documented extension path: academic record correction, with a multi-role chain, a rejection an appeal can reopen, and its own evidence rather than the first domain's.</w:t>
+      </w:r>
+    </w:p>
+    <w:p>
+      <w:pPr>
+        <w:keepLines/>
+        <w:widowControl/>
+      </w:pPr>
+      <w:r>
+        <w:rPr>
+          <w:rFonts w:ascii="Arial" w:hAnsi="Arial"/>
+          <w:b w:val="0"/>
+          <w:i w:val="0"/>
+          <w:color w:val="000000"/>
+          <w:sz w:val="21"/>
+        </w:rPr>
+        <w:t>Assurance is checked four ways, each answering a question a hand-written test suite cannot. Randomised property testing compares generated tool calls against a predicate written independently of the implementation. Bounded model checking enumerates the profile's declared authority space, runs the real enforcement code against every configuration, and checks five invariants: the combination nobody imagined. Ablation removes one control at a time and measures whether the harm returns, because a control whose removal changes nothing was decorative and the assurance matrix should stop claiming it. A portable conformance suite re-runs the properties against whatever backends an institution has substituted, naming for each check the requirement it defends, so a failure states which claim was lost rather than merely turning red.</w:t>
       </w:r>
     </w:p>
     <w:p>
@@ -262,71 +450,150 @@
         <w:pStyle w:val="Heading1"/>
       </w:pPr>
       <w:r>
-        <w:t>Development 2 — Results, analysis, and impact</w:t>
+        <w:t>Development Section 2 Results Analysis and Impact</w:t>
       </w:r>
     </w:p>
     <w:p>
       <w:pPr>
-        <w:keepLines w:val="0"/>
+        <w:pStyle w:val="Sectionnote"/>
       </w:pPr>
       <w:r>
-        <w:t>All results are fixture observations in declared local settings. They are not security odds, certification, or proof of production readiness. Against the synthetic student support profile, 30 of 30 attacks were contained with zero unauthorized mutations. Six of six benign tasks completed, for a 0.0 false denial rate. Reporting utility beside containment stops a system that refuses everything from looking successful.</w:t>
+        <w:rPr>
+          <w:rFonts w:ascii="Arial" w:hAnsi="Arial"/>
+          <w:b w:val="0"/>
+          <w:i/>
+          <w:color w:val="000000"/>
+          <w:sz w:val="18"/>
+        </w:rPr>
+        <w:t>Official limit 550 to 650 words  |  Draft count 586 words</w:t>
       </w:r>
     </w:p>
     <w:p>
       <w:pPr>
-        <w:keepLines w:val="0"/>
+        <w:keepLines/>
+        <w:widowControl/>
       </w:pPr>
       <w:r>
-        <w:t>The same seven attacks and valid tasks were applied to three designs. An unguarded model, tool list, and loop contained none and delivered 28 harmful actions. A prompt guarded arm with a safety instruction and per agent tool allowlist contained 29 percent and delivered eight. This baseline is credible because an allowlist stops some attacks. The full design contained all seven and delivered none while completing the same benign work.</w:t>
+        <w:rPr>
+          <w:rFonts w:ascii="Arial" w:hAnsi="Arial"/>
+          <w:b w:val="0"/>
+          <w:i w:val="0"/>
+          <w:color w:val="000000"/>
+          <w:sz w:val="21"/>
+        </w:rPr>
+        <w:t>All results are fixture observations in declared local environments: not security probabilities, a certification, or evidence of production readiness.</w:t>
       </w:r>
     </w:p>
     <w:p>
       <w:pPr>
-        <w:keepLines w:val="0"/>
+        <w:keepLines/>
+        <w:widowControl/>
       </w:pPr>
       <w:r>
-        <w:t>The bounded model checker explored 240 states with zero invariant breaks and reached 11 denial controls. It exposed a flaw in the earlier tests. Attacks that changed expiry, audience, or reviewer role hit the signature check first, so later controls were never reached. Using genuine approvals for the wrong proposal, executor, or transition made each claimed denial reachable. The conformance suite also found that the first SQL evidence adapter failed to enforce its write key. Both flaws became regression tests.</w:t>
+        <w:rPr>
+          <w:rFonts w:ascii="Arial" w:hAnsi="Arial"/>
+          <w:b w:val="0"/>
+          <w:i w:val="0"/>
+          <w:color w:val="000000"/>
+          <w:sz w:val="21"/>
+        </w:rPr>
+        <w:t>Against the synthetic student-support profile, 30 of 30 adversarial scenarios were contained with zero unauthorised mutations, and 6 of 6 benign tasks completed for a false-denial rate of 0.0. Reporting utility beside containment stops a system that refuses everything from looking successful. Bounded model checking explored 240 configurations with zero invariant violations, reaching 11 distinct denial controls. Eight of eight ablated controls restored their harm when removed: authority coverage 1.0. Twenty-five conformance checks passed on two independent backends, and a 32-caller replay race produced one mutation and one receipt.</w:t>
       </w:r>
     </w:p>
     <w:p>
       <w:pPr>
-        <w:keepLines w:val="0"/>
+        <w:keepLines/>
+        <w:widowControl/>
       </w:pPr>
       <w:r>
-        <w:t>Eight of eight ablated controls restored their matching harm, for authority coverage of 1.0. Twenty five conformance checks pass on two backend profiles. A 32 caller race against one approved request produced one mutation, one receipt, one intent, one outcome, and 31 replay replies. This covers one process, not distributed linearizability. In total, 187 deterministic tests run offline. Generated result files keep paper and code figures aligned.</w:t>
+        <w:rPr>
+          <w:rFonts w:ascii="Arial" w:hAnsi="Arial"/>
+          <w:b w:val="0"/>
+          <w:i w:val="0"/>
+          <w:color w:val="000000"/>
+          <w:sz w:val="21"/>
+        </w:rPr>
+        <w:t>The same hostile proposals and legitimate work went to three architectures. An unguarded agent contained none and delivered 28 harmful actions. A prompt-guarded arm, adding the two mitigations most widely deployed today, contained 29 percent and delivered 8. That arm is a fair account of practice, not a strawman: an allowlist is a real control that lacks enforcement independent of the model. The full architecture contained all seven and delivered none, at no cost to benign completion.</w:t>
       </w:r>
     </w:p>
     <w:p>
       <w:pPr>
-        <w:keepLines w:val="0"/>
+        <w:keepLines/>
+        <w:widowControl/>
       </w:pPr>
       <w:r>
-        <w:t>The impact serves both halves of the theme. For AI for Learning, the framework supports education services while keeping high impact authority and redress under institutional rule. For Learning for AI, it is a lab: learners mark a boundary, try a violation, inspect refusal and evidence, remove a control, and recover the service. Institutions can share profiles, tests, and recovery patterns without sharing student records. The seven fields also form a supplier question set and adoption checklist for policy, audit, education, and engineering teams.</w:t>
+        <w:rPr>
+          <w:rFonts w:ascii="Arial" w:hAnsi="Arial"/>
+          <w:b w:val="0"/>
+          <w:i w:val="0"/>
+          <w:color w:val="000000"/>
+          <w:sz w:val="21"/>
+        </w:rPr>
+        <w:t>The oversight results are the new contribution. With shipped defaults, a roster of 11 reviewers sustains 2,640 consequential actions per day, bound by the declared quota rather than by attention. In a queue trial, 40 arrivals reach one reviewer budgeted for 8. Some proposals are structurally perfect and substantively wrong: correct operation, current version, authentic approval, ineligible applicant. No digest detects that and no invariant excludes it; the only control behind that harm is a person who is reading. Without load control, four such failures execute. With it, none do, and 32 actions defer to manual review. That deferral is the finding, not a defect to tune away: it makes over-capacity arithmetic instead of invisible. One caveat is essential: the degradation curve is a declared parameter, not a measurement of any officer; observing real reviewers is open work.</w:t>
       </w:r>
     </w:p>
     <w:p>
       <w:pPr>
-        <w:keepLines w:val="0"/>
+        <w:keepLines/>
+        <w:widowControl/>
       </w:pPr>
       <w:r>
-        <w:t>Open questions include a compromised host or signer, attack rates for named models, reviewer accuracy and work, appeal quality, fairness, access, cost, energy, and independent audit. Logical separation on one host does not prove independent trust.</w:t>
+        <w:rPr>
+          <w:rFonts w:ascii="Arial" w:hAnsi="Arial"/>
+          <w:b w:val="0"/>
+          <w:i w:val="0"/>
+          <w:color w:val="000000"/>
+          <w:sz w:val="21"/>
+        </w:rPr>
+        <w:t>The second domain repaid the effort at once. The identical suite holds with no library change: 4,800 configurations with zero violations, 30 of 30 scenarios contained, 9 of 9 benign tasks, 25 conformance checks. It also failed on first run, and the defect was genuine. A declared approval role on a routine transition was silently ignored, because the enforcement map was built only from consequential rules. The field was mandatory in the schema, visible to any reviewer, and absent at runtime. One domain could not reach it; two did.</w:t>
       </w:r>
     </w:p>
     <w:p>
       <w:pPr>
-        <w:keepLines w:val="0"/>
+        <w:keepLines/>
+        <w:widowControl/>
       </w:pPr>
       <w:r>
-        <w:t>The results change how adoption can start. A university, ministry, or civil group can begin with one low volume action and publish its contract, synthetic tests, failure evidence, and exclusions before using personal data. Reviewers can repeat the claims on a disconnected laptop. Engineers can run the suite against their database or event bus. Buyers can ask vendors to show the denial path against the real side effect, not just a policy. Shared tests then travel across borders without pooling data or forcing one vendor stack.</w:t>
+        <w:rPr>
+          <w:rFonts w:ascii="Arial" w:hAnsi="Arial"/>
+          <w:b w:val="0"/>
+          <w:i w:val="0"/>
+          <w:color w:val="000000"/>
+          <w:sz w:val="21"/>
+        </w:rPr>
+        <w:t>Because every attack was written by the people who built the defence, an open adversary corpus now ships. A contributed attack is seven fields of YAML, scored against all three architectures and attributed to its contributor. No student record or vendor name is needed, and no contributor code runs. The tool prints how many attacks came from outside the project; today that number is zero, stated in the output rather than buried in a limitation.</w:t>
       </w:r>
     </w:p>
     <w:p>
       <w:pPr>
-        <w:keepLines w:val="0"/>
+        <w:keepLines/>
+        <w:widowControl/>
       </w:pPr>
       <w:r>
-        <w:t>The evaluation separates containment from decision quality. Exact approval can stop an unapproved change yet let biased advice reach a reviewer. Domain pilots must add outcome, access, bias, and appeal measures to the security properties. They must report reviewer effort and false denials because blocking valid support can harm students. Six benign fixtures show that the reference remains practically usable; they do not prove educational benefit.</w:t>
+        <w:rPr>
+          <w:rFonts w:ascii="Arial" w:hAnsi="Arial"/>
+          <w:b w:val="0"/>
+          <w:i w:val="0"/>
+          <w:color w:val="000000"/>
+          <w:sz w:val="21"/>
+        </w:rPr>
+        <w:t>For AI for Learning, this governs administration. For Learning for AI, it teaches system literacy: trace data, bound delegation, verify controls, calculate escalation capacity, and reconstruct accountability. Participants violate a boundary, watch refusal, remove the control, and watch harm return. Institutions unable to pool infrastructure can pool failures. No learning gain is claimed; none has been measured.</w:t>
+      </w:r>
+    </w:p>
+    <w:p>
+      <w:pPr>
+        <w:keepLines/>
+        <w:widowControl/>
+      </w:pPr>
+      <w:r>
+        <w:rPr>
+          <w:rFonts w:ascii="Arial" w:hAnsi="Arial"/>
+          <w:b w:val="0"/>
+          <w:i w:val="0"/>
+          <w:color w:val="000000"/>
+          <w:sz w:val="21"/>
+        </w:rPr>
+        <w:t>Open questions remain: a compromised host or signing authority, injection rates for named models, reviewer accuracy under load, appeal quality, fairness, cost, energy, and independent audit. Separate containers on one host are logical separation, not independent administrative trust.</w:t>
       </w:r>
     </w:p>
     <w:p>
@@ -339,26 +606,65 @@
     </w:p>
     <w:p>
       <w:pPr>
-        <w:keepLines w:val="0"/>
+        <w:pStyle w:val="Sectionnote"/>
       </w:pPr>
       <w:r>
-        <w:t>Trust by Construction changes AI governance from a model promise to a testable boundary around a high impact action. In the student support case, an agent may gather evidence and propose a change, while an authorized person and separate executor decide if that exact change may occur. A changed or stale proposal needs new review. An uncertain result enters reconciliation, not a blind retry. A complete evidence record supports inquiry and appeal.</w:t>
+        <w:rPr>
+          <w:rFonts w:ascii="Arial" w:hAnsi="Arial"/>
+          <w:b w:val="0"/>
+          <w:i/>
+          <w:color w:val="000000"/>
+          <w:sz w:val="18"/>
+        </w:rPr>
+        <w:t>Official limit 200 to 250 words  |  Draft count 228 words</w:t>
       </w:r>
     </w:p>
     <w:p>
       <w:pPr>
-        <w:keepLines w:val="0"/>
+        <w:keepLines/>
+        <w:widowControl/>
       </w:pPr>
       <w:r>
-        <w:t>Adopters can replace the technology without losing the questions. Each capability must name its protected asset, allowed operation, enforcement point, owner, failure test, evidence, and recovery response. The public repo supplies runnable profiles, attacks, valid tasks, ablations, model checking, conformance tests, a replay race, deployment parts, and extension guidance. A new domain inherits the structure but no assurance claim until its tests pass.</w:t>
+        <w:rPr>
+          <w:rFonts w:ascii="Arial" w:hAnsi="Arial"/>
+          <w:b w:val="0"/>
+          <w:i w:val="0"/>
+          <w:color w:val="000000"/>
+          <w:sz w:val="21"/>
+        </w:rPr>
+        <w:t>Trust by Construction moves AI governance from a promise about a model to a testable boundary around a high-impact action. In the student-support case an agent may gather evidence and propose a change, while an authorised person and a separate executor decide whether that exact change may occur. A changed or stale proposal requires fresh review. An uncertain outcome enters reconciliation rather than a blind retry. A complete evidence record supports inquiry and appeal.</w:t>
       </w:r>
     </w:p>
     <w:p>
       <w:pPr>
-        <w:keepLines w:val="0"/>
+        <w:keepLines/>
+        <w:widowControl/>
       </w:pPr>
       <w:r>
-        <w:t>Future work will test distributed interleavings, named local models under varied attacks, reviewer work, access, fairness, recovery time, cost, and energy. Pilots must test identity control, key custody, backup restore, evidence retention, and every physical link around a data diode. Even a governed agent can apply an unjust rule faster. This design makes decisions attributable and contestable; it does not make policy fair. That bounded contribution helps institutions decide which powers to delegate and when automation must stop.</w:t>
+        <w:rPr>
+          <w:rFonts w:ascii="Arial" w:hAnsi="Arial"/>
+          <w:b w:val="0"/>
+          <w:i w:val="0"/>
+          <w:color w:val="000000"/>
+          <w:sz w:val="21"/>
+        </w:rPr>
+        <w:t>Three propositions follow, and I offer them to the panel as claims to argue with. First, an institution should publish its oversight ceiling before its automation roadmap; one that cannot say how many consequential decisions it can genuinely review per day has not established that it can oversee what it is deploying. Second, no consequential agent capability should ship without a named authorisation boundary, an executable failure test, and a recovery owner, which any institution can publish for one capability this quarter with no budget. Third, institutions should trade failure cases rather than platforms, since shared attacks build capacity without moving a single student record.</w:t>
+      </w:r>
+    </w:p>
+    <w:p>
+      <w:pPr>
+        <w:keepLines/>
+        <w:widowControl/>
+      </w:pPr>
+      <w:r>
+        <w:rPr>
+          <w:rFonts w:ascii="Arial" w:hAnsi="Arial"/>
+          <w:b w:val="0"/>
+          <w:i w:val="0"/>
+          <w:color w:val="000000"/>
+          <w:sz w:val="21"/>
+        </w:rPr>
+        <w:t>Even a perfectly governed agent can apply an unjust rule faster. This architecture makes harm attributable and contestable; it does not make a rule fair. That bounded contribution still answers the student who asked why, and it helps institutions decide which powers to delegate and when automation must stop.</w:t>
       </w:r>
     </w:p>
     <w:p>
@@ -371,101 +677,124 @@
     </w:p>
     <w:p>
       <w:pPr>
-        <w:spacing w:after="60"/>
-        <w:ind w:left="259" w:hanging="259"/>
+        <w:spacing w:after="100"/>
+        <w:ind w:left="317" w:hanging="317"/>
       </w:pPr>
       <w:r>
-        <w:t>Autio, C., et al. (2024). Artificial Intelligence Risk Management Framework Generative Artificial Intelligence Profile. NIST AI 600 1. https://doi.org/10.6028/NIST.AI.600-1</w:t>
+        <w:rPr>
+          <w:rFonts w:ascii="Arial" w:hAnsi="Arial"/>
+          <w:b w:val="0"/>
+          <w:i w:val="0"/>
+          <w:color w:val="000000"/>
+          <w:sz w:val="18"/>
+        </w:rPr>
+        <w:t>Autio, C., et al. (2024). Artificial Intelligence Risk Management Framework: Generative Artificial Intelligence Profile. NIST AI 600-1. https://doi.org/10.6028/NIST.AI.600-1</w:t>
       </w:r>
     </w:p>
     <w:p>
       <w:pPr>
-        <w:spacing w:after="60"/>
-        <w:ind w:left="259" w:hanging="259"/>
+        <w:spacing w:after="100"/>
+        <w:ind w:left="317" w:hanging="317"/>
       </w:pPr>
       <w:r>
-        <w:t>ISO IEC. (2023). ISO IEC 42001 2023 Information technology Artificial intelligence Management system. https://www.iso.org/standard/81230.html</w:t>
+        <w:rPr>
+          <w:rFonts w:ascii="Arial" w:hAnsi="Arial"/>
+          <w:b w:val="0"/>
+          <w:i w:val="0"/>
+          <w:color w:val="000000"/>
+          <w:sz w:val="18"/>
+        </w:rPr>
+        <w:t>ISO/IEC. (2023). ISO/IEC 42001:2023 - Information technology, Artificial intelligence, Management system. https://www.iso.org/standard/81230.html</w:t>
       </w:r>
     </w:p>
     <w:p>
       <w:pPr>
-        <w:spacing w:after="60"/>
-        <w:ind w:left="259" w:hanging="259"/>
+        <w:spacing w:after="100"/>
+        <w:ind w:left="317" w:hanging="317"/>
       </w:pPr>
       <w:r>
+        <w:rPr>
+          <w:rFonts w:ascii="Arial" w:hAnsi="Arial"/>
+          <w:b w:val="0"/>
+          <w:i w:val="0"/>
+          <w:color w:val="000000"/>
+          <w:sz w:val="18"/>
+        </w:rPr>
         <w:t>Miao, F., and Cukurova, M. (2024). AI competency framework for teachers. UNESCO. https://unesdoc.unesco.org/ark:/48223/pf0000391104</w:t>
       </w:r>
     </w:p>
     <w:p>
       <w:pPr>
-        <w:spacing w:after="60"/>
-        <w:ind w:left="259" w:hanging="259"/>
+        <w:spacing w:after="100"/>
+        <w:ind w:left="317" w:hanging="317"/>
       </w:pPr>
       <w:r>
+        <w:rPr>
+          <w:rFonts w:ascii="Arial" w:hAnsi="Arial"/>
+          <w:b w:val="0"/>
+          <w:i w:val="0"/>
+          <w:color w:val="000000"/>
+          <w:sz w:val="18"/>
+        </w:rPr>
         <w:t>OWASP GenAI Security Project. (2025). OWASP Top 10 for Agentic Applications 2026. https://genai.owasp.org/resource/owasp-top-10-for-agentic-applications-for-2026/</w:t>
       </w:r>
     </w:p>
     <w:p>
       <w:pPr>
-        <w:spacing w:after="60"/>
-        <w:ind w:left="259" w:hanging="259"/>
+        <w:spacing w:after="100"/>
+        <w:ind w:left="317" w:hanging="317"/>
       </w:pPr>
       <w:r>
-        <w:t>Rose, S., Borchert, O., Mitchell, S., and Connelly, S. (2020). Zero Trust Architecture. NIST SP 800 207. https://doi.org/10.6028/NIST.SP.800-207</w:t>
+        <w:rPr>
+          <w:rFonts w:ascii="Arial" w:hAnsi="Arial"/>
+          <w:b w:val="0"/>
+          <w:i w:val="0"/>
+          <w:color w:val="000000"/>
+          <w:sz w:val="18"/>
+        </w:rPr>
+        <w:t>Parasuraman, R., and Manzey, D. (2010). Complacency and bias in human use of automation: an attentional integration. Human Factors, 52(3), 381-410. https://doi.org/10.1177/0018720810376055</w:t>
       </w:r>
     </w:p>
     <w:p>
       <w:pPr>
-        <w:spacing w:after="60"/>
-        <w:ind w:left="259" w:hanging="259"/>
+        <w:spacing w:after="100"/>
+        <w:ind w:left="317" w:hanging="317"/>
       </w:pPr>
       <w:r>
+        <w:rPr>
+          <w:rFonts w:ascii="Arial" w:hAnsi="Arial"/>
+          <w:b w:val="0"/>
+          <w:i w:val="0"/>
+          <w:color w:val="000000"/>
+          <w:sz w:val="18"/>
+        </w:rPr>
+        <w:t>Rose, S., Borchert, O., Mitchell, S., and Connelly, S. (2020). Zero Trust Architecture. NIST SP 800-207. https://doi.org/10.6028/NIST.SP.800-207</w:t>
+      </w:r>
+    </w:p>
+    <w:p>
+      <w:pPr>
+        <w:spacing w:after="100"/>
+        <w:ind w:left="317" w:hanging="317"/>
+      </w:pPr>
+      <w:r>
+        <w:rPr>
+          <w:rFonts w:ascii="Arial" w:hAnsi="Arial"/>
+          <w:b w:val="0"/>
+          <w:i w:val="0"/>
+          <w:color w:val="000000"/>
+          <w:sz w:val="18"/>
+        </w:rPr>
         <w:t>United Nations. (2024). Global Digital Compact. https://www.un.org/pact-for-the-future/en/annex-i-global-digital-compact</w:t>
       </w:r>
     </w:p>
     <w:sectPr>
-      <w:headerReference w:type="default" r:id="rId9"/>
-      <w:footerReference w:type="default" r:id="rId10"/>
       <w:pgSz w:w="12240" w:h="15840"/>
-      <w:pgMar w:top="835" w:right="1080" w:bottom="835" w:left="1080" w:header="720" w:footer="720" w:gutter="0"/>
+      <w:pgMar w:top="1123" w:right="1267" w:bottom="1123" w:left="1267" w:header="720" w:footer="720" w:gutter="0"/>
       <w:cols w:space="720"/>
       <w:docGrid w:linePitch="360"/>
     </w:sectPr>
   </w:body>
 </w:document>
-</file>
-
-<file path=word/footer1.xml><?xml version="1.0" encoding="utf-8"?>
-<w:ftr xmlns:m="http://schemas.openxmlformats.org/officeDocument/2006/math" xmlns:mc="http://schemas.openxmlformats.org/markup-compatibility/2006" xmlns:mo="http://schemas.microsoft.com/office/mac/office/2008/main" xmlns:mv="urn:schemas-microsoft-com:mac:vml" xmlns:o="urn:schemas-microsoft-com:office:office" xmlns:r="http://schemas.openxmlformats.org/officeDocument/2006/relationships" xmlns:v="urn:schemas-microsoft-com:vml" xmlns:w10="urn:schemas-microsoft-com:office:word" xmlns:w14="http://schemas.microsoft.com/office/word/2010/wordml" xmlns:w="http://schemas.openxmlformats.org/wordprocessingml/2006/main" xmlns:wne="http://schemas.microsoft.com/office/word/2006/wordml" xmlns:wp14="http://schemas.microsoft.com/office/word/2010/wordprocessingDrawing" xmlns:wp="http://schemas.openxmlformats.org/drawingml/2006/wordprocessingDrawing" xmlns:wpc="http://schemas.microsoft.com/office/word/2010/wordprocessingCanvas" xmlns:wpg="http://schemas.microsoft.com/office/word/2010/wordprocessingGroup" xmlns:wpi="http://schemas.microsoft.com/office/word/2010/wordprocessingInk" xmlns:wps="http://schemas.microsoft.com/office/word/2010/wordprocessingShape" mc:Ignorable="w14 wp14">
-  <w:p>
-    <w:pPr>
-      <w:pStyle w:val="Footer"/>
-      <w:jc w:val="center"/>
-    </w:pPr>
-    <w:r>
-      <w:rPr>
-        <w:rFonts w:ascii="Arial" w:hAnsi="Arial"/>
-        <w:sz w:val="16"/>
-      </w:rPr>
-      <w:t xml:space="preserve">Trust by Construction  •  </w:t>
-    </w:r>
-    <w:fldSimple w:instr="PAGE"/>
-  </w:p>
-</w:ftr>
-</file>
-
-<file path=word/header1.xml><?xml version="1.0" encoding="utf-8"?>
-<w:hdr xmlns:m="http://schemas.openxmlformats.org/officeDocument/2006/math" xmlns:mc="http://schemas.openxmlformats.org/markup-compatibility/2006" xmlns:mo="http://schemas.microsoft.com/office/mac/office/2008/main" xmlns:mv="urn:schemas-microsoft-com:mac:vml" xmlns:o="urn:schemas-microsoft-com:office:office" xmlns:r="http://schemas.openxmlformats.org/officeDocument/2006/relationships" xmlns:v="urn:schemas-microsoft-com:vml" xmlns:w10="urn:schemas-microsoft-com:office:word" xmlns:w14="http://schemas.microsoft.com/office/word/2010/wordml" xmlns:w="http://schemas.openxmlformats.org/wordprocessingml/2006/main" xmlns:wne="http://schemas.microsoft.com/office/word/2006/wordml" xmlns:wp14="http://schemas.microsoft.com/office/word/2010/wordprocessingDrawing" xmlns:wp="http://schemas.openxmlformats.org/drawingml/2006/wordprocessingDrawing" xmlns:wpc="http://schemas.microsoft.com/office/word/2010/wordprocessingCanvas" xmlns:wpg="http://schemas.microsoft.com/office/word/2010/wordprocessingGroup" xmlns:wpi="http://schemas.microsoft.com/office/word/2010/wordprocessingInk" xmlns:wps="http://schemas.microsoft.com/office/word/2010/wordprocessingShape" mc:Ignorable="w14 wp14">
-  <w:p>
-    <w:pPr>
-      <w:pStyle w:val="Metadata"/>
-      <w:jc w:val="right"/>
-    </w:pPr>
-    <w:r>
-      <w:t>UNU Macau AI Conference 2026  |  Extended Abstract</w:t>
-    </w:r>
-  </w:p>
-</w:hdr>
 </file>
 
 <file path=word/numbering.xml><?xml version="1.0" encoding="utf-8"?>
@@ -832,12 +1161,12 @@
     <w:qFormat/>
     <w:rsid w:val="00FC693F"/>
     <w:pPr>
-      <w:spacing w:after="110" w:line="250" w:lineRule="auto"/>
+      <w:spacing w:after="130" w:line="259" w:lineRule="auto"/>
     </w:pPr>
     <w:rPr>
       <w:rFonts w:ascii="Arial" w:hAnsi="Arial"/>
-      <w:color w:val="232B34"/>
-      <w:sz w:val="20"/>
+      <w:color w:val="000000"/>
+      <w:sz w:val="21"/>
     </w:rPr>
   </w:style>
   <w:style w:type="paragraph" w:styleId="Header">
@@ -895,15 +1224,15 @@
     <w:pPr>
       <w:keepNext/>
       <w:keepLines/>
-      <w:spacing w:before="180" w:after="80"/>
+      <w:spacing w:before="240" w:after="100"/>
       <w:outlineLvl w:val="0"/>
     </w:pPr>
     <w:rPr>
       <w:rFonts w:asciiTheme="majorHAnsi" w:eastAsiaTheme="majorEastAsia" w:hAnsiTheme="majorHAnsi" w:cstheme="majorBidi" w:ascii="Arial" w:hAnsi="Arial"/>
       <w:b/>
       <w:bCs/>
-      <w:color w:val="007F7A"/>
-      <w:sz w:val="26"/>
+      <w:color w:val="000000"/>
+      <w:sz w:val="27"/>
       <w:szCs w:val="28"/>
     </w:rPr>
   </w:style>
@@ -919,15 +1248,15 @@
     <w:pPr>
       <w:keepNext/>
       <w:keepLines/>
-      <w:spacing w:before="200" w:after="0"/>
+      <w:spacing w:before="240" w:after="100"/>
       <w:outlineLvl w:val="1"/>
     </w:pPr>
     <w:rPr>
-      <w:rFonts w:asciiTheme="majorHAnsi" w:eastAsiaTheme="majorEastAsia" w:hAnsiTheme="majorHAnsi" w:cstheme="majorBidi"/>
+      <w:rFonts w:asciiTheme="majorHAnsi" w:eastAsiaTheme="majorEastAsia" w:hAnsiTheme="majorHAnsi" w:cstheme="majorBidi" w:ascii="Arial" w:hAnsi="Arial"/>
       <w:b/>
       <w:bCs/>
-      <w:color w:val="4F81BD" w:themeColor="accent1"/>
-      <w:sz w:val="26"/>
+      <w:color w:val="000000"/>
+      <w:sz w:val="23"/>
       <w:szCs w:val="26"/>
     </w:rPr>
   </w:style>
@@ -1181,18 +1510,16 @@
     <w:qFormat/>
     <w:rsid w:val="00FC693F"/>
     <w:pPr>
-      <w:pBdr>
-        <w:bottom w:val="single" w:sz="8" w:space="4" w:color="4F81BD" w:themeColor="accent1"/>
-      </w:pBdr>
-      <w:spacing w:after="300" w:line="240" w:lineRule="auto"/>
+      <w:spacing w:after="240" w:line="240" w:lineRule="auto"/>
       <w:contextualSpacing/>
     </w:pPr>
     <w:rPr>
       <w:rFonts w:asciiTheme="majorHAnsi" w:eastAsiaTheme="majorEastAsia" w:hAnsiTheme="majorHAnsi" w:cstheme="majorBidi" w:ascii="Arial" w:hAnsi="Arial"/>
-      <w:color w:val="12314A"/>
+      <w:b/>
+      <w:color w:val="000000"/>
       <w:spacing w:val="5"/>
       <w:kern w:val="28"/>
-      <w:sz w:val="46"/>
+      <w:sz w:val="36"/>
       <w:szCs w:val="52"/>
     </w:rPr>
   </w:style>
@@ -1225,12 +1552,12 @@
       </w:numPr>
     </w:pPr>
     <w:rPr>
-      <w:rFonts w:asciiTheme="majorHAnsi" w:eastAsiaTheme="majorEastAsia" w:hAnsiTheme="majorHAnsi" w:cstheme="majorBidi" w:ascii="Arial" w:hAnsi="Arial"/>
+      <w:rFonts w:asciiTheme="majorHAnsi" w:eastAsiaTheme="majorEastAsia" w:hAnsiTheme="majorHAnsi" w:cstheme="majorBidi"/>
       <w:i/>
       <w:iCs/>
-      <w:color w:val="3C6478"/>
+      <w:color w:val="4F81BD" w:themeColor="accent1"/>
       <w:spacing w:val="15"/>
-      <w:sz w:val="22"/>
+      <w:sz w:val="24"/>
       <w:szCs w:val="24"/>
     </w:rPr>
   </w:style>
@@ -12522,14 +12849,16 @@
       </w:tcPr>
     </w:tblStylePr>
   </w:style>
-  <w:style w:type="paragraph" w:customStyle="1" w:styleId="Metadata">
-    <w:name w:val="Metadata"/>
-    <w:pPr>
-      <w:spacing w:after="40"/>
+  <w:style w:type="paragraph" w:customStyle="1" w:styleId="Sectionnote">
+    <w:name w:val="Section note"/>
+    <w:pPr>
+      <w:keepNext/>
+      <w:spacing w:after="100"/>
     </w:pPr>
     <w:rPr>
       <w:rFonts w:ascii="Arial" w:hAnsi="Arial"/>
-      <w:color w:val="526472"/>
+      <w:i/>
+      <w:color w:val="464646"/>
       <w:sz w:val="18"/>
     </w:rPr>
   </w:style>

</xml_diff>